<commit_message>
feat(jflap): agrega gramática base y extensión en JFLAP con capturas de verificación
</commit_message>
<xml_diff>
--- a/docs/Informe_Laboratorio_3.docx
+++ b/docs/Informe_Laboratorio_3.docx
@@ -351,7 +351,7 @@
                 <w:rFonts w:ascii="Times New Roman" w:hAnsi="Times New Roman" w:cs="Times New Roman" w:eastAsia="Times New Roman"/>
                 <w:sz w:val="21"/>
               </w:rPr>
-              <w:t>21 de octubre de 2026</w:t>
+              <w:t>24 de octubre de 2026</w:t>
             </w:r>
           </w:p>
         </w:tc>
@@ -383,6 +383,12 @@
           <w:rFonts w:ascii="Times New Roman" w:hAnsi="Times New Roman" w:cs="Times New Roman" w:eastAsia="Times New Roman"/>
         </w:rPr>
         <w:t>El objetivo del laboratorio es diseñar, analizar y validar una Gramática Libre de Contexto (GLC) que represente la estructura sintáctica de un lenguaje de programación simplificado. Se identifican los terminales, los no terminales y el símbolo inicial; se define formalmente G = (V, Σ, P, S); se construyen las producciones para programas con una o más instrucciones (asignaciones simples, asignaciones con una operación aritmética y salidas); y se comprueba la coherencia de la gramática mediante derivaciones por la izquierda, un árbol de derivación y la clasificación de cadenas válidas e inválidas. Los conceptos centrales son símbolo inicial, lenguaje generado L(G), derivación, árbol sintáctico y la separación entre análisis léxico (identificadores y números) y análisis sintáctico (orden de las categorías). Como extensión creativa se incorporan declaraciones de variables de tipo entero y real.</w:t>
+      </w:r>
+      <w:r>
+        <w:rPr>
+          <w:rFonts w:ascii="Times New Roman" w:hAnsi="Times New Roman" w:cs="Times New Roman" w:eastAsia="Times New Roman"/>
+        </w:rPr>
+        <w:t xml:space="preserve"> La gramática se implementó y verificó además en JFLAP (Anexo A.4), con sus archivos .jff adjuntos en el repositorio.</w:t>
       </w:r>
     </w:p>
     <w:p>
@@ -1471,6 +1477,7 @@
     <w:p>
       <w:pPr>
         <w:keepNext/>
+        <w:keepNext/>
         <w:spacing w:after="40" w:before="120"/>
       </w:pPr>
       <w:r>
@@ -2894,7 +2901,7 @@
           <w:rFonts w:ascii="Times New Roman" w:hAnsi="Times New Roman" w:cs="Times New Roman" w:eastAsia="Times New Roman"/>
           <w:sz w:val="20"/>
         </w:rPr>
-        <w:t>Árbol de derivación de z = x + y # con raíz &lt;instruccion&gt; (Figura 1) y el mismo árbol dentro del programa mínimo, con raíz el símbolo inicial &lt;programa&gt; (Figura 2).</w:t>
+        <w:t>Árbol de derivación de z = x + y # con raíz &lt;instruccion&gt; (Figura 1) y el mismo árbol dentro del programa mínimo, con raíz el símbolo inicial &lt;programa&gt; (Figura 2). La Figura 3 muestra el mismo árbol construido en JFLAP con lab3_extension.jff, que escribe cada símbolo con una letra (traducción en el Anexo A.4): las hojas b p i corresponden a Begin Programa ID[prueba], las hojas i = i + i # a ID[z] = ID[x] + ID[y] #, y e a End.</w:t>
       </w:r>
     </w:p>
     <w:p>
@@ -2955,7 +2962,7 @@
           <w:rFonts w:ascii="Times New Roman" w:hAnsi="Times New Roman" w:cs="Times New Roman" w:eastAsia="Times New Roman"/>
           <w:sz w:val="18"/>
         </w:rPr>
-        <w:t>Árbol de derivación de z = x + y # desde &lt;instruccion&gt;. No terminales en azul (nodos internos); terminales en verde (hojas). Generado con Graphviz a partir de la estructura que devuelve el validador. No se utilizó JFLAP.</w:t>
+        <w:t>Árbol de derivación de z = x + y # desde &lt;instruccion&gt;. No terminales en azul (nodos internos); terminales en verde (hojas). Generado con Graphviz a partir de la estructura que devuelve el validador.</w:t>
       </w:r>
     </w:p>
     <w:p>
@@ -3021,92 +3028,154 @@
     </w:p>
     <w:p>
       <w:pPr>
-        <w:rPr>
-          <w:rFonts w:ascii="Times New Roman" w:hAnsi="Times New Roman" w:cs="Times New Roman"/>
-        </w:rPr>
-      </w:pPr>
-      <w:r>
-        <w:rPr>
-          <w:rFonts w:ascii="Times New Roman" w:hAnsi="Times New Roman" w:cs="Times New Roman"/>
-        </w:rPr>
-        <w:t>d) Explicación del árbol</w:t>
+        <w:keepNext/>
+        <w:spacing w:after="0"/>
+        <w:jc w:val="center"/>
+      </w:pPr>
+      <w:r>
+        <w:drawing>
+          <wp:inline xmlns:a="http://schemas.openxmlformats.org/drawingml/2006/main" xmlns:pic="http://schemas.openxmlformats.org/drawingml/2006/picture">
+            <wp:extent cx="4206240" cy="2564646"/>
+            <wp:docPr id="3" name="Picture 3"/>
+            <wp:cNvGraphicFramePr>
+              <a:graphicFrameLocks noChangeAspect="1"/>
+            </wp:cNvGraphicFramePr>
+            <a:graphic>
+              <a:graphicData uri="http://schemas.openxmlformats.org/drawingml/2006/picture">
+                <pic:pic>
+                  <pic:nvPicPr>
+                    <pic:cNvPr id="0" name="arbol_z_x_mas_y.jpg"/>
+                    <pic:cNvPicPr/>
+                  </pic:nvPicPr>
+                  <pic:blipFill>
+                    <a:blip r:embed="rId13"/>
+                    <a:stretch>
+                      <a:fillRect/>
+                    </a:stretch>
+                  </pic:blipFill>
+                  <pic:spPr>
+                    <a:xfrm>
+                      <a:off x="0" y="0"/>
+                      <a:ext cx="4206240" cy="2564646"/>
+                    </a:xfrm>
+                    <a:prstGeom prst="rect"/>
+                  </pic:spPr>
+                </pic:pic>
+              </a:graphicData>
+            </a:graphic>
+          </wp:inline>
+        </w:drawing>
       </w:r>
     </w:p>
     <w:p>
       <w:pPr>
-        <w:rPr>
-          <w:rFonts w:ascii="Times New Roman" w:hAnsi="Times New Roman" w:cs="Times New Roman"/>
-        </w:rPr>
+        <w:spacing w:after="120"/>
+        <w:jc w:val="center"/>
       </w:pPr>
       <w:r>
         <w:rPr>
           <w:rFonts w:ascii="Times New Roman" w:hAnsi="Times New Roman" w:cs="Times New Roman" w:eastAsia="Times New Roman"/>
-        </w:rPr>
-        <w:t xml:space="preserve">En el árbol de la Figura 1 la raíz es </w:t>
-      </w:r>
-      <w:r>
-        <w:rPr>
-          <w:rFonts w:ascii="Courier New" w:hAnsi="Courier New" w:cs="Courier New" w:eastAsia="Courier New"/>
-        </w:rPr>
-        <w:t>&lt;instruccion&gt;</w:t>
+          <w:b/>
+          <w:sz w:val="18"/>
+        </w:rPr>
+        <w:t xml:space="preserve">Figura 3. </w:t>
       </w:r>
       <w:r>
         <w:rPr>
           <w:rFonts w:ascii="Times New Roman" w:hAnsi="Times New Roman" w:cs="Times New Roman" w:eastAsia="Times New Roman"/>
-        </w:rPr>
-        <w:t xml:space="preserve"> y en el de la Figura 2 es </w:t>
-      </w:r>
-      <w:r>
-        <w:rPr>
-          <w:rFonts w:ascii="Courier New" w:hAnsi="Courier New" w:cs="Courier New" w:eastAsia="Courier New"/>
-        </w:rPr>
-        <w:t>&lt;programa&gt;</w:t>
-      </w:r>
-      <w:r>
-        <w:rPr>
-          <w:rFonts w:ascii="Times New Roman" w:hAnsi="Times New Roman" w:cs="Times New Roman" w:eastAsia="Times New Roman"/>
-        </w:rPr>
-        <w:t xml:space="preserve">, el símbolo inicial S, que representa el programa completo. Los nodos internos son siempre símbolos no terminales: cada uno se expande en sus hijos aplicando exactamente una producción, y el conjunto de hijos, leído de izquierda a derecha, es el lado derecho de esa producción (por ejemplo, </w:t>
-      </w:r>
-      <w:r>
-        <w:rPr>
-          <w:rFonts w:ascii="Courier New" w:hAnsi="Courier New" w:cs="Courier New" w:eastAsia="Courier New"/>
-        </w:rPr>
-        <w:t>&lt;expresion&gt;</w:t>
-      </w:r>
-      <w:r>
-        <w:rPr>
-          <w:rFonts w:ascii="Times New Roman" w:hAnsi="Times New Roman" w:cs="Times New Roman" w:eastAsia="Times New Roman"/>
-        </w:rPr>
-        <w:t xml:space="preserve"> tiene como hijos </w:t>
-      </w:r>
-      <w:r>
-        <w:rPr>
-          <w:rFonts w:ascii="Courier New" w:hAnsi="Courier New" w:cs="Courier New" w:eastAsia="Courier New"/>
-        </w:rPr>
-        <w:t>&lt;operando&gt; &lt;operador&gt; &lt;operando&gt;</w:t>
-      </w:r>
-      <w:r>
-        <w:rPr>
-          <w:rFonts w:ascii="Times New Roman" w:hAnsi="Times New Roman" w:cs="Times New Roman" w:eastAsia="Times New Roman"/>
-        </w:rPr>
-        <w:t xml:space="preserve"> según </w:t>
-      </w:r>
-      <w:r>
-        <w:rPr>
-          <w:rFonts w:ascii="Courier New" w:hAnsi="Courier New" w:cs="Courier New" w:eastAsia="Courier New"/>
-        </w:rPr>
-        <w:t>&lt;expresion&gt; → &lt;operando&gt; &lt;operador&gt; &lt;operando&gt;</w:t>
-      </w:r>
-      <w:r>
-        <w:rPr>
-          <w:rFonts w:ascii="Times New Roman" w:hAnsi="Times New Roman" w:cs="Times New Roman" w:eastAsia="Times New Roman"/>
-        </w:rPr>
-        <w:t>).</w:t>
+          <w:sz w:val="18"/>
+        </w:rPr>
+        <w:t xml:space="preserve">Árbol de derivación de z = x + y # (cadena bpii=i+i#e) en JFLAP con lab3_extension.jff; la derivación termina sin variables pendientes («Derivations complete»). Raíz S (= &lt;programa&gt;); hojas b p i i = i + i # e.</w:t>
       </w:r>
     </w:p>
     <w:p>
       <w:pPr>
+        <w:rPr>
+          <w:rFonts w:ascii="Times New Roman" w:hAnsi="Times New Roman" w:cs="Times New Roman"/>
+        </w:rPr>
+      </w:pPr>
+      <w:r>
+        <w:rPr>
+          <w:rFonts w:ascii="Times New Roman" w:hAnsi="Times New Roman" w:cs="Times New Roman"/>
+        </w:rPr>
+        <w:t>d) Explicación del árbol</w:t>
+      </w:r>
+    </w:p>
+    <w:p>
+      <w:pPr>
+        <w:rPr>
+          <w:rFonts w:ascii="Times New Roman" w:hAnsi="Times New Roman" w:cs="Times New Roman"/>
+        </w:rPr>
+      </w:pPr>
+      <w:r>
+        <w:rPr>
+          <w:rFonts w:ascii="Times New Roman" w:hAnsi="Times New Roman" w:cs="Times New Roman" w:eastAsia="Times New Roman"/>
+        </w:rPr>
+        <w:t xml:space="preserve">En el árbol de la Figura 1 la raíz es </w:t>
+      </w:r>
+      <w:r>
+        <w:rPr>
+          <w:rFonts w:ascii="Courier New" w:hAnsi="Courier New" w:cs="Courier New" w:eastAsia="Courier New"/>
+        </w:rPr>
+        <w:t>&lt;instruccion&gt;</w:t>
+      </w:r>
+      <w:r>
+        <w:rPr>
+          <w:rFonts w:ascii="Times New Roman" w:hAnsi="Times New Roman" w:cs="Times New Roman" w:eastAsia="Times New Roman"/>
+        </w:rPr>
+        <w:t xml:space="preserve"> y en el de la Figura 2 es </w:t>
+      </w:r>
+      <w:r>
+        <w:rPr>
+          <w:rFonts w:ascii="Courier New" w:hAnsi="Courier New" w:cs="Courier New" w:eastAsia="Courier New"/>
+        </w:rPr>
+        <w:t>&lt;programa&gt;</w:t>
+      </w:r>
+      <w:r>
+        <w:rPr>
+          <w:rFonts w:ascii="Times New Roman" w:hAnsi="Times New Roman" w:cs="Times New Roman" w:eastAsia="Times New Roman"/>
+        </w:rPr>
+        <w:t xml:space="preserve">, el símbolo inicial S, que representa el programa completo. Los nodos internos son siempre símbolos no terminales: cada uno se expande en sus hijos aplicando exactamente una producción, y el conjunto de hijos, leído de izquierda a derecha, es el lado derecho de esa producción (por ejemplo, </w:t>
+      </w:r>
+      <w:r>
+        <w:rPr>
+          <w:rFonts w:ascii="Courier New" w:hAnsi="Courier New" w:cs="Courier New" w:eastAsia="Courier New"/>
+        </w:rPr>
+        <w:t>&lt;expresion&gt;</w:t>
+      </w:r>
+      <w:r>
+        <w:rPr>
+          <w:rFonts w:ascii="Times New Roman" w:hAnsi="Times New Roman" w:cs="Times New Roman" w:eastAsia="Times New Roman"/>
+        </w:rPr>
+        <w:t xml:space="preserve"> tiene como hijos </w:t>
+      </w:r>
+      <w:r>
+        <w:rPr>
+          <w:rFonts w:ascii="Courier New" w:hAnsi="Courier New" w:cs="Courier New" w:eastAsia="Courier New"/>
+        </w:rPr>
+        <w:t>&lt;operando&gt; &lt;operador&gt; &lt;operando&gt;</w:t>
+      </w:r>
+      <w:r>
+        <w:rPr>
+          <w:rFonts w:ascii="Times New Roman" w:hAnsi="Times New Roman" w:cs="Times New Roman" w:eastAsia="Times New Roman"/>
+        </w:rPr>
+        <w:t xml:space="preserve"> según </w:t>
+      </w:r>
+      <w:r>
+        <w:rPr>
+          <w:rFonts w:ascii="Courier New" w:hAnsi="Courier New" w:cs="Courier New" w:eastAsia="Courier New"/>
+        </w:rPr>
+        <w:t>&lt;expresion&gt; → &lt;operando&gt; &lt;operador&gt; &lt;operando&gt;</w:t>
+      </w:r>
+      <w:r>
+        <w:rPr>
+          <w:rFonts w:ascii="Times New Roman" w:hAnsi="Times New Roman" w:cs="Times New Roman" w:eastAsia="Times New Roman"/>
+        </w:rPr>
+        <w:t>).</w:t>
+      </w:r>
+    </w:p>
+    <w:p>
+      <w:pPr>
         <w:spacing w:after="80"/>
       </w:pPr>
       <w:r>
@@ -3150,6 +3219,12 @@
           <w:rFonts w:ascii="Times New Roman" w:hAnsi="Times New Roman" w:cs="Times New Roman" w:eastAsia="Times New Roman"/>
         </w:rPr>
         <w:t>. Cada árbol coincide paso a paso con la derivación por la izquierda correspondiente de la sección a): cada expansión de un no terminal es un nodo interno con sus hijos. Los corchetes ID[z] indican el lexema del token y no son símbolos adicionales.</w:t>
+      </w:r>
+      <w:r>
+        <w:rPr>
+          <w:rFonts w:ascii="Times New Roman" w:hAnsi="Times New Roman" w:cs="Times New Roman" w:eastAsia="Times New Roman"/>
+        </w:rPr>
+        <w:t xml:space="preserve"> El árbol de JFLAP (Figura 3) cumple la misma relación: la raíz es S, los nodos internos son variables (S, L, I, R, E, O, M) y las hojas, leídas de izquierda a derecha, forman bpii=i+i#e.</w:t>
       </w:r>
     </w:p>
     <w:p>
@@ -3475,6 +3550,13 @@
         </w:rPr>
         <w:t>Los casos 1 a 7 son instrucciones y se comprueban contra L(&lt;instruccion&gt;); el caso 8 es un programa completo y se comprueba contra L(&lt;programa&gt;). Ninguna de las instrucciones 1 a 3 pertenece a L(&lt;programa&gt;) por sí sola. Las posiciones de error (línea, columna) las informa validador.py (--fragmento para los casos 1 a 7).</w:t>
       </w:r>
+      <w:r>
+        <w:rPr>
+          <w:rFonts w:ascii="Times New Roman" w:hAnsi="Times New Roman" w:cs="Times New Roman" w:eastAsia="Times New Roman"/>
+          <w:sz w:val="20"/>
+        </w:rPr>
+        <w:t xml:space="preserve"> Los ocho casos se verificaron además en JFLAP con las cadenas traducidas (Anexo A.4, Tabla de cadenas y Figura 5), con los mismos resultados.</w:t>
+      </w:r>
     </w:p>
     <w:tbl>
       <w:tblPr>
@@ -4965,7 +5047,20 @@
           <w:rFonts w:ascii="Times New Roman" w:hAnsi="Times New Roman" w:cs="Times New Roman" w:eastAsia="Times New Roman"/>
           <w:sz w:val="20"/>
         </w:rPr>
-        <w:t>No se utilizó JFLAP; los árboles se generaron con Graphviz (.dot, .svg y .png en el repositorio).</w:t>
+        <w:t>Se utilizó JFLAP: se adjuntan lab3_base.jff (gramática base, 17 producciones) y lab3_extension.jff (base más extensión, 21 producciones) en la carpeta jflap/ del repositorio: https://github.com/der-kaffe/info1148-laboratorio-3/tree/main/jflap</w:t>
+      </w:r>
+    </w:p>
+    <w:p>
+      <w:pPr>
+        <w:pStyle w:val="Listaconvietas"/>
+        <w:spacing w:after="20"/>
+      </w:pPr>
+      <w:r>
+        <w:rPr>
+          <w:rFonts w:ascii="Times New Roman" w:hAnsi="Times New Roman" w:cs="Times New Roman" w:eastAsia="Times New Roman"/>
+          <w:sz w:val="20"/>
+        </w:rPr>
+        <w:t>Los árboles se generaron con JFLAP (capturas en jflap/capturas/) y con Graphviz (.dot, .svg y .png en arbol_sintactico/). Ambos corresponden a la misma gramática.</w:t>
       </w:r>
     </w:p>
     <w:p>
@@ -5039,7 +5134,7 @@
           <w:rFonts w:ascii="Times New Roman" w:hAnsi="Times New Roman" w:cs="Times New Roman" w:eastAsia="Times New Roman"/>
           <w:sz w:val="20"/>
         </w:rPr>
-        <w:t>gramatica.bnf, validador.py, ejemplos/ (programa de referencia, programa extendido y casos), evidencias/ (validacion.json, derivaciones.txt, árboles en JSON y pruebas.txt con 25 pruebas automatizadas) y arbol_sintactico/ (.dot, .svg, .png).</w:t>
+        <w:t>gramatica.bnf, validador.py, ejemplos/ (programa de referencia, programa extendido y casos), evidencias/ (validacion.json, derivaciones.txt, árboles en JSON y pruebas.txt con 25 pruebas automatizadas), arbol_sintactico/ (.dot, .svg, .png) y jflap/ (lab3_base.jff, lab3_extension.jff y capturas).</w:t>
       </w:r>
     </w:p>
     <w:p>
@@ -6557,6 +6652,2135 @@
           <w:sz w:val="16"/>
         </w:rPr>
         <w:t>End</w:t>
+      </w:r>
+    </w:p>
+    <w:p>
+      <w:pPr>
+        <w:pageBreakBefore/>
+        <w:keepNext/>
+        <w:spacing w:after="40" w:before="160"/>
+      </w:pPr>
+      <w:r>
+        <w:rPr>
+          <w:rFonts w:ascii="Times New Roman" w:hAnsi="Times New Roman" w:cs="Times New Roman" w:eastAsia="Times New Roman"/>
+          <w:b/>
+          <w:sz w:val="21"/>
+        </w:rPr>
+        <w:t xml:space="preserve">A.4 Verificación en JFLAP</w:t>
+      </w:r>
+    </w:p>
+    <w:p>
+      <w:pPr>
+        <w:spacing w:after="60"/>
+      </w:pPr>
+      <w:r>
+        <w:rPr>
+          <w:rFonts w:ascii="Times New Roman" w:hAnsi="Times New Roman" w:cs="Times New Roman" w:eastAsia="Times New Roman"/>
+          <w:sz w:val="19"/>
+        </w:rPr>
+        <w:t xml:space="preserve">La gramática se ingresó en JFLAP (opción Grammar) y se guardó en dos archivos: </w:t>
+      </w:r>
+      <w:r>
+        <w:rPr>
+          <w:rFonts w:ascii="Courier New" w:hAnsi="Courier New" w:cs="Courier New" w:eastAsia="Courier New"/>
+          <w:sz w:val="19"/>
+        </w:rPr>
+        <w:t xml:space="preserve">lab3_base.jff</w:t>
+      </w:r>
+      <w:r>
+        <w:rPr>
+          <w:rFonts w:ascii="Times New Roman" w:hAnsi="Times New Roman" w:cs="Times New Roman" w:eastAsia="Times New Roman"/>
+          <w:sz w:val="19"/>
+        </w:rPr>
+        <w:t xml:space="preserve"> (las 17 producciones de la Pregunta 2) y </w:t>
+      </w:r>
+      <w:r>
+        <w:rPr>
+          <w:rFonts w:ascii="Courier New" w:hAnsi="Courier New" w:cs="Courier New" w:eastAsia="Courier New"/>
+          <w:sz w:val="19"/>
+        </w:rPr>
+        <w:t xml:space="preserve">lab3_extension.jff</w:t>
+      </w:r>
+      <w:r>
+        <w:rPr>
+          <w:rFonts w:ascii="Times New Roman" w:hAnsi="Times New Roman" w:cs="Times New Roman" w:eastAsia="Times New Roman"/>
+          <w:sz w:val="19"/>
+        </w:rPr>
+        <w:t xml:space="preserve"> (esas 17 más las 4 de la extensión, 21 en total). JFLAP solo admite símbolos de una letra, por lo que cada símbolo del informe se tradujo como indica la tabla; ID y NUM siguen siendo categorías (i y n). Las Figuras 3, 4 y 5 se obtuvieron con lab3_extension.jff.</w:t>
+      </w:r>
+    </w:p>
+    <w:p>
+      <w:pPr>
+        <w:keepNext/>
+        <w:spacing w:after="40"/>
+      </w:pPr>
+      <w:r>
+        <w:rPr>
+          <w:rFonts w:ascii="Times New Roman" w:hAnsi="Times New Roman" w:cs="Times New Roman" w:eastAsia="Times New Roman"/>
+          <w:b/>
+          <w:sz w:val="19"/>
+        </w:rPr>
+        <w:t xml:space="preserve">Traducción de símbolos</w:t>
+      </w:r>
+    </w:p>
+    <w:tbl>
+      <w:tblPr>
+        <w:tblStyle w:val="Tablaconcuadrcula"/>
+        <w:tblW w:w="0" w:type="auto"/>
+        <w:jc w:val="center"/>
+        <w:tblLook w:val="04A0" w:firstRow="1" w:lastRow="0" w:firstColumn="1" w:lastColumn="0" w:noHBand="0" w:noVBand="1"/>
+      </w:tblPr>
+      <w:tblGrid>
+        <w:gridCol w:w="2900"/>
+        <w:gridCol w:w="1500"/>
+        <w:gridCol w:w="2900"/>
+        <w:gridCol w:w="1500"/>
+      </w:tblGrid>
+      <w:tr>
+        <w:trPr>
+          <w:jc w:val="center"/>
+          <w:cantSplit/>
+          <w:tblHeader/>
+        </w:trPr>
+        <w:tc>
+          <w:tcPr>
+            <w:tcW w:w="2900" w:type="dxa"/>
+            <w:shd w:val="clear" w:color="auto" w:fill="D9EAF7"/>
+          </w:tcPr>
+          <w:p>
+            <w:pPr>
+              <w:spacing w:after="20" w:before="20"/>
+            </w:pPr>
+            <w:r>
+              <w:rPr>
+                <w:rFonts w:ascii="Times New Roman" w:hAnsi="Times New Roman" w:cs="Times New Roman" w:eastAsia="Times New Roman"/>
+                <w:b/>
+                <w:sz w:val="18"/>
+              </w:rPr>
+              <w:t xml:space="preserve">No terminal del informe</w:t>
+            </w:r>
+          </w:p>
+        </w:tc>
+        <w:tc>
+          <w:tcPr>
+            <w:tcW w:w="1500" w:type="dxa"/>
+            <w:shd w:val="clear" w:color="auto" w:fill="D9EAF7"/>
+          </w:tcPr>
+          <w:p>
+            <w:pPr>
+              <w:spacing w:after="20" w:before="20"/>
+            </w:pPr>
+            <w:r>
+              <w:rPr>
+                <w:rFonts w:ascii="Times New Roman" w:hAnsi="Times New Roman" w:cs="Times New Roman" w:eastAsia="Times New Roman"/>
+                <w:b/>
+                <w:sz w:val="18"/>
+              </w:rPr>
+              <w:t xml:space="preserve">JFLAP</w:t>
+            </w:r>
+          </w:p>
+        </w:tc>
+        <w:tc>
+          <w:tcPr>
+            <w:tcW w:w="2900" w:type="dxa"/>
+            <w:shd w:val="clear" w:color="auto" w:fill="D9EAF7"/>
+          </w:tcPr>
+          <w:p>
+            <w:pPr>
+              <w:spacing w:after="20" w:before="20"/>
+            </w:pPr>
+            <w:r>
+              <w:rPr>
+                <w:rFonts w:ascii="Times New Roman" w:hAnsi="Times New Roman" w:cs="Times New Roman" w:eastAsia="Times New Roman"/>
+                <w:b/>
+                <w:sz w:val="18"/>
+              </w:rPr>
+              <w:t xml:space="preserve">Terminal del informe</w:t>
+            </w:r>
+          </w:p>
+        </w:tc>
+        <w:tc>
+          <w:tcPr>
+            <w:tcW w:w="1500" w:type="dxa"/>
+            <w:shd w:val="clear" w:color="auto" w:fill="D9EAF7"/>
+          </w:tcPr>
+          <w:p>
+            <w:pPr>
+              <w:spacing w:after="20" w:before="20"/>
+            </w:pPr>
+            <w:r>
+              <w:rPr>
+                <w:rFonts w:ascii="Times New Roman" w:hAnsi="Times New Roman" w:cs="Times New Roman" w:eastAsia="Times New Roman"/>
+                <w:b/>
+                <w:sz w:val="18"/>
+              </w:rPr>
+              <w:t xml:space="preserve">JFLAP</w:t>
+            </w:r>
+          </w:p>
+        </w:tc>
+      </w:tr>
+      <w:tr>
+        <w:trPr>
+          <w:jc w:val="center"/>
+          <w:cantSplit/>
+        </w:trPr>
+        <w:tc>
+          <w:tcPr>
+            <w:tcW w:w="2900" w:type="dxa"/>
+          </w:tcPr>
+          <w:p>
+            <w:pPr>
+              <w:spacing w:after="20" w:before="20"/>
+            </w:pPr>
+            <w:r>
+              <w:rPr>
+                <w:rFonts w:ascii="Times New Roman" w:hAnsi="Times New Roman" w:cs="Times New Roman" w:eastAsia="Times New Roman"/>
+                <w:sz w:val="17"/>
+              </w:rPr>
+              <w:t xml:space="preserve">&lt;programa&gt; (símbolo inicial)</w:t>
+            </w:r>
+          </w:p>
+        </w:tc>
+        <w:tc>
+          <w:tcPr>
+            <w:tcW w:w="1500" w:type="dxa"/>
+          </w:tcPr>
+          <w:p>
+            <w:pPr>
+              <w:spacing w:after="20" w:before="20"/>
+            </w:pPr>
+            <w:r>
+              <w:rPr>
+                <w:rFonts w:ascii="Courier New" w:hAnsi="Courier New" w:cs="Courier New" w:eastAsia="Courier New"/>
+                <w:sz w:val="17"/>
+              </w:rPr>
+              <w:t xml:space="preserve">S</w:t>
+            </w:r>
+          </w:p>
+        </w:tc>
+        <w:tc>
+          <w:tcPr>
+            <w:tcW w:w="2900" w:type="dxa"/>
+          </w:tcPr>
+          <w:p>
+            <w:pPr>
+              <w:spacing w:after="20" w:before="20"/>
+            </w:pPr>
+            <w:r>
+              <w:rPr>
+                <w:rFonts w:ascii="Times New Roman" w:hAnsi="Times New Roman" w:cs="Times New Roman" w:eastAsia="Times New Roman"/>
+                <w:sz w:val="17"/>
+              </w:rPr>
+              <w:t xml:space="preserve">Begin</w:t>
+            </w:r>
+          </w:p>
+        </w:tc>
+        <w:tc>
+          <w:tcPr>
+            <w:tcW w:w="1500" w:type="dxa"/>
+          </w:tcPr>
+          <w:p>
+            <w:pPr>
+              <w:spacing w:after="20" w:before="20"/>
+            </w:pPr>
+            <w:r>
+              <w:rPr>
+                <w:rFonts w:ascii="Courier New" w:hAnsi="Courier New" w:cs="Courier New" w:eastAsia="Courier New"/>
+                <w:sz w:val="17"/>
+              </w:rPr>
+              <w:t xml:space="preserve">b</w:t>
+            </w:r>
+          </w:p>
+        </w:tc>
+      </w:tr>
+      <w:tr>
+        <w:trPr>
+          <w:jc w:val="center"/>
+          <w:cantSplit/>
+        </w:trPr>
+        <w:tc>
+          <w:tcPr>
+            <w:tcW w:w="2900" w:type="dxa"/>
+          </w:tcPr>
+          <w:p>
+            <w:pPr>
+              <w:spacing w:after="20" w:before="20"/>
+            </w:pPr>
+            <w:r>
+              <w:rPr>
+                <w:rFonts w:ascii="Times New Roman" w:hAnsi="Times New Roman" w:cs="Times New Roman" w:eastAsia="Times New Roman"/>
+                <w:sz w:val="17"/>
+              </w:rPr>
+              <w:t xml:space="preserve">&lt;lista_instrucciones&gt;</w:t>
+            </w:r>
+          </w:p>
+        </w:tc>
+        <w:tc>
+          <w:tcPr>
+            <w:tcW w:w="1500" w:type="dxa"/>
+          </w:tcPr>
+          <w:p>
+            <w:pPr>
+              <w:spacing w:after="20" w:before="20"/>
+            </w:pPr>
+            <w:r>
+              <w:rPr>
+                <w:rFonts w:ascii="Courier New" w:hAnsi="Courier New" w:cs="Courier New" w:eastAsia="Courier New"/>
+                <w:sz w:val="17"/>
+              </w:rPr>
+              <w:t xml:space="preserve">L</w:t>
+            </w:r>
+          </w:p>
+        </w:tc>
+        <w:tc>
+          <w:tcPr>
+            <w:tcW w:w="2900" w:type="dxa"/>
+          </w:tcPr>
+          <w:p>
+            <w:pPr>
+              <w:spacing w:after="20" w:before="20"/>
+            </w:pPr>
+            <w:r>
+              <w:rPr>
+                <w:rFonts w:ascii="Times New Roman" w:hAnsi="Times New Roman" w:cs="Times New Roman" w:eastAsia="Times New Roman"/>
+                <w:sz w:val="17"/>
+              </w:rPr>
+              <w:t xml:space="preserve">Programa</w:t>
+            </w:r>
+          </w:p>
+        </w:tc>
+        <w:tc>
+          <w:tcPr>
+            <w:tcW w:w="1500" w:type="dxa"/>
+          </w:tcPr>
+          <w:p>
+            <w:pPr>
+              <w:spacing w:after="20" w:before="20"/>
+            </w:pPr>
+            <w:r>
+              <w:rPr>
+                <w:rFonts w:ascii="Courier New" w:hAnsi="Courier New" w:cs="Courier New" w:eastAsia="Courier New"/>
+                <w:sz w:val="17"/>
+              </w:rPr>
+              <w:t xml:space="preserve">p</w:t>
+            </w:r>
+          </w:p>
+        </w:tc>
+      </w:tr>
+      <w:tr>
+        <w:trPr>
+          <w:jc w:val="center"/>
+          <w:cantSplit/>
+        </w:trPr>
+        <w:tc>
+          <w:tcPr>
+            <w:tcW w:w="2900" w:type="dxa"/>
+          </w:tcPr>
+          <w:p>
+            <w:pPr>
+              <w:spacing w:after="20" w:before="20"/>
+            </w:pPr>
+            <w:r>
+              <w:rPr>
+                <w:rFonts w:ascii="Times New Roman" w:hAnsi="Times New Roman" w:cs="Times New Roman" w:eastAsia="Times New Roman"/>
+                <w:sz w:val="17"/>
+              </w:rPr>
+              <w:t xml:space="preserve">&lt;instruccion&gt;</w:t>
+            </w:r>
+          </w:p>
+        </w:tc>
+        <w:tc>
+          <w:tcPr>
+            <w:tcW w:w="1500" w:type="dxa"/>
+          </w:tcPr>
+          <w:p>
+            <w:pPr>
+              <w:spacing w:after="20" w:before="20"/>
+            </w:pPr>
+            <w:r>
+              <w:rPr>
+                <w:rFonts w:ascii="Courier New" w:hAnsi="Courier New" w:cs="Courier New" w:eastAsia="Courier New"/>
+                <w:sz w:val="17"/>
+              </w:rPr>
+              <w:t xml:space="preserve">I</w:t>
+            </w:r>
+          </w:p>
+        </w:tc>
+        <w:tc>
+          <w:tcPr>
+            <w:tcW w:w="2900" w:type="dxa"/>
+          </w:tcPr>
+          <w:p>
+            <w:pPr>
+              <w:spacing w:after="20" w:before="20"/>
+            </w:pPr>
+            <w:r>
+              <w:rPr>
+                <w:rFonts w:ascii="Times New Roman" w:hAnsi="Times New Roman" w:cs="Times New Roman" w:eastAsia="Times New Roman"/>
+                <w:sz w:val="17"/>
+              </w:rPr>
+              <w:t xml:space="preserve">End</w:t>
+            </w:r>
+          </w:p>
+        </w:tc>
+        <w:tc>
+          <w:tcPr>
+            <w:tcW w:w="1500" w:type="dxa"/>
+          </w:tcPr>
+          <w:p>
+            <w:pPr>
+              <w:spacing w:after="20" w:before="20"/>
+            </w:pPr>
+            <w:r>
+              <w:rPr>
+                <w:rFonts w:ascii="Courier New" w:hAnsi="Courier New" w:cs="Courier New" w:eastAsia="Courier New"/>
+                <w:sz w:val="17"/>
+              </w:rPr>
+              <w:t xml:space="preserve">e</w:t>
+            </w:r>
+          </w:p>
+        </w:tc>
+      </w:tr>
+      <w:tr>
+        <w:trPr>
+          <w:jc w:val="center"/>
+          <w:cantSplit/>
+        </w:trPr>
+        <w:tc>
+          <w:tcPr>
+            <w:tcW w:w="2900" w:type="dxa"/>
+          </w:tcPr>
+          <w:p>
+            <w:pPr>
+              <w:spacing w:after="20" w:before="20"/>
+            </w:pPr>
+            <w:r>
+              <w:rPr>
+                <w:rFonts w:ascii="Times New Roman" w:hAnsi="Times New Roman" w:cs="Times New Roman" w:eastAsia="Times New Roman"/>
+                <w:sz w:val="17"/>
+              </w:rPr>
+              <w:t xml:space="preserve">&lt;asignacion_simple&gt;</w:t>
+            </w:r>
+          </w:p>
+        </w:tc>
+        <w:tc>
+          <w:tcPr>
+            <w:tcW w:w="1500" w:type="dxa"/>
+          </w:tcPr>
+          <w:p>
+            <w:pPr>
+              <w:spacing w:after="20" w:before="20"/>
+            </w:pPr>
+            <w:r>
+              <w:rPr>
+                <w:rFonts w:ascii="Courier New" w:hAnsi="Courier New" w:cs="Courier New" w:eastAsia="Courier New"/>
+                <w:sz w:val="17"/>
+              </w:rPr>
+              <w:t xml:space="preserve">A</w:t>
+            </w:r>
+          </w:p>
+        </w:tc>
+        <w:tc>
+          <w:tcPr>
+            <w:tcW w:w="2900" w:type="dxa"/>
+          </w:tcPr>
+          <w:p>
+            <w:pPr>
+              <w:spacing w:after="20" w:before="20"/>
+            </w:pPr>
+            <w:r>
+              <w:rPr>
+                <w:rFonts w:ascii="Times New Roman" w:hAnsi="Times New Roman" w:cs="Times New Roman" w:eastAsia="Times New Roman"/>
+                <w:sz w:val="17"/>
+              </w:rPr>
+              <w:t xml:space="preserve">salida</w:t>
+            </w:r>
+          </w:p>
+        </w:tc>
+        <w:tc>
+          <w:tcPr>
+            <w:tcW w:w="1500" w:type="dxa"/>
+          </w:tcPr>
+          <w:p>
+            <w:pPr>
+              <w:spacing w:after="20" w:before="20"/>
+            </w:pPr>
+            <w:r>
+              <w:rPr>
+                <w:rFonts w:ascii="Courier New" w:hAnsi="Courier New" w:cs="Courier New" w:eastAsia="Courier New"/>
+                <w:sz w:val="17"/>
+              </w:rPr>
+              <w:t xml:space="preserve">o</w:t>
+            </w:r>
+          </w:p>
+        </w:tc>
+      </w:tr>
+      <w:tr>
+        <w:trPr>
+          <w:jc w:val="center"/>
+          <w:cantSplit/>
+        </w:trPr>
+        <w:tc>
+          <w:tcPr>
+            <w:tcW w:w="2900" w:type="dxa"/>
+          </w:tcPr>
+          <w:p>
+            <w:pPr>
+              <w:spacing w:after="20" w:before="20"/>
+            </w:pPr>
+            <w:r>
+              <w:rPr>
+                <w:rFonts w:ascii="Times New Roman" w:hAnsi="Times New Roman" w:cs="Times New Roman" w:eastAsia="Times New Roman"/>
+                <w:sz w:val="17"/>
+              </w:rPr>
+              <w:t xml:space="preserve">&lt;asignacion_aritmetica&gt;</w:t>
+            </w:r>
+          </w:p>
+        </w:tc>
+        <w:tc>
+          <w:tcPr>
+            <w:tcW w:w="1500" w:type="dxa"/>
+          </w:tcPr>
+          <w:p>
+            <w:pPr>
+              <w:spacing w:after="20" w:before="20"/>
+            </w:pPr>
+            <w:r>
+              <w:rPr>
+                <w:rFonts w:ascii="Courier New" w:hAnsi="Courier New" w:cs="Courier New" w:eastAsia="Courier New"/>
+                <w:sz w:val="17"/>
+              </w:rPr>
+              <w:t xml:space="preserve">R</w:t>
+            </w:r>
+          </w:p>
+        </w:tc>
+        <w:tc>
+          <w:tcPr>
+            <w:tcW w:w="2900" w:type="dxa"/>
+          </w:tcPr>
+          <w:p>
+            <w:pPr>
+              <w:spacing w:after="20" w:before="20"/>
+            </w:pPr>
+            <w:r>
+              <w:rPr>
+                <w:rFonts w:ascii="Times New Roman" w:hAnsi="Times New Roman" w:cs="Times New Roman" w:eastAsia="Times New Roman"/>
+                <w:sz w:val="17"/>
+              </w:rPr>
+              <w:t xml:space="preserve">ID</w:t>
+            </w:r>
+          </w:p>
+        </w:tc>
+        <w:tc>
+          <w:tcPr>
+            <w:tcW w:w="1500" w:type="dxa"/>
+          </w:tcPr>
+          <w:p>
+            <w:pPr>
+              <w:spacing w:after="20" w:before="20"/>
+            </w:pPr>
+            <w:r>
+              <w:rPr>
+                <w:rFonts w:ascii="Courier New" w:hAnsi="Courier New" w:cs="Courier New" w:eastAsia="Courier New"/>
+                <w:sz w:val="17"/>
+              </w:rPr>
+              <w:t xml:space="preserve">i</w:t>
+            </w:r>
+          </w:p>
+        </w:tc>
+      </w:tr>
+      <w:tr>
+        <w:trPr>
+          <w:jc w:val="center"/>
+          <w:cantSplit/>
+        </w:trPr>
+        <w:tc>
+          <w:tcPr>
+            <w:tcW w:w="2900" w:type="dxa"/>
+          </w:tcPr>
+          <w:p>
+            <w:pPr>
+              <w:spacing w:after="20" w:before="20"/>
+            </w:pPr>
+            <w:r>
+              <w:rPr>
+                <w:rFonts w:ascii="Times New Roman" w:hAnsi="Times New Roman" w:cs="Times New Roman" w:eastAsia="Times New Roman"/>
+                <w:sz w:val="17"/>
+              </w:rPr>
+              <w:t xml:space="preserve">&lt;expresion&gt;</w:t>
+            </w:r>
+          </w:p>
+        </w:tc>
+        <w:tc>
+          <w:tcPr>
+            <w:tcW w:w="1500" w:type="dxa"/>
+          </w:tcPr>
+          <w:p>
+            <w:pPr>
+              <w:spacing w:after="20" w:before="20"/>
+            </w:pPr>
+            <w:r>
+              <w:rPr>
+                <w:rFonts w:ascii="Courier New" w:hAnsi="Courier New" w:cs="Courier New" w:eastAsia="Courier New"/>
+                <w:sz w:val="17"/>
+              </w:rPr>
+              <w:t xml:space="preserve">E</w:t>
+            </w:r>
+          </w:p>
+        </w:tc>
+        <w:tc>
+          <w:tcPr>
+            <w:tcW w:w="2900" w:type="dxa"/>
+          </w:tcPr>
+          <w:p>
+            <w:pPr>
+              <w:spacing w:after="20" w:before="20"/>
+            </w:pPr>
+            <w:r>
+              <w:rPr>
+                <w:rFonts w:ascii="Times New Roman" w:hAnsi="Times New Roman" w:cs="Times New Roman" w:eastAsia="Times New Roman"/>
+                <w:sz w:val="17"/>
+              </w:rPr>
+              <w:t xml:space="preserve">NUM</w:t>
+            </w:r>
+          </w:p>
+        </w:tc>
+        <w:tc>
+          <w:tcPr>
+            <w:tcW w:w="1500" w:type="dxa"/>
+          </w:tcPr>
+          <w:p>
+            <w:pPr>
+              <w:spacing w:after="20" w:before="20"/>
+            </w:pPr>
+            <w:r>
+              <w:rPr>
+                <w:rFonts w:ascii="Courier New" w:hAnsi="Courier New" w:cs="Courier New" w:eastAsia="Courier New"/>
+                <w:sz w:val="17"/>
+              </w:rPr>
+              <w:t xml:space="preserve">n</w:t>
+            </w:r>
+          </w:p>
+        </w:tc>
+      </w:tr>
+      <w:tr>
+        <w:trPr>
+          <w:jc w:val="center"/>
+          <w:cantSplit/>
+        </w:trPr>
+        <w:tc>
+          <w:tcPr>
+            <w:tcW w:w="2900" w:type="dxa"/>
+          </w:tcPr>
+          <w:p>
+            <w:pPr>
+              <w:spacing w:after="20" w:before="20"/>
+            </w:pPr>
+            <w:r>
+              <w:rPr>
+                <w:rFonts w:ascii="Times New Roman" w:hAnsi="Times New Roman" w:cs="Times New Roman" w:eastAsia="Times New Roman"/>
+                <w:sz w:val="17"/>
+              </w:rPr>
+              <w:t xml:space="preserve">&lt;operando&gt;</w:t>
+            </w:r>
+          </w:p>
+        </w:tc>
+        <w:tc>
+          <w:tcPr>
+            <w:tcW w:w="1500" w:type="dxa"/>
+          </w:tcPr>
+          <w:p>
+            <w:pPr>
+              <w:spacing w:after="20" w:before="20"/>
+            </w:pPr>
+            <w:r>
+              <w:rPr>
+                <w:rFonts w:ascii="Courier New" w:hAnsi="Courier New" w:cs="Courier New" w:eastAsia="Courier New"/>
+                <w:sz w:val="17"/>
+              </w:rPr>
+              <w:t xml:space="preserve">O</w:t>
+            </w:r>
+          </w:p>
+        </w:tc>
+        <w:tc>
+          <w:tcPr>
+            <w:tcW w:w="2900" w:type="dxa"/>
+          </w:tcPr>
+          <w:p>
+            <w:pPr>
+              <w:spacing w:after="20" w:before="20"/>
+            </w:pPr>
+            <w:r>
+              <w:rPr>
+                <w:rFonts w:ascii="Times New Roman" w:hAnsi="Times New Roman" w:cs="Times New Roman" w:eastAsia="Times New Roman"/>
+                <w:sz w:val="17"/>
+              </w:rPr>
+              <w:t xml:space="preserve">= # + - * / %</w:t>
+            </w:r>
+          </w:p>
+        </w:tc>
+        <w:tc>
+          <w:tcPr>
+            <w:tcW w:w="1500" w:type="dxa"/>
+          </w:tcPr>
+          <w:p>
+            <w:pPr>
+              <w:spacing w:after="20" w:before="20"/>
+            </w:pPr>
+            <w:r>
+              <w:rPr>
+                <w:rFonts w:ascii="Courier New" w:hAnsi="Courier New" w:cs="Courier New" w:eastAsia="Courier New"/>
+                <w:sz w:val="17"/>
+              </w:rPr>
+              <w:t xml:space="preserve">(iguales)</w:t>
+            </w:r>
+          </w:p>
+        </w:tc>
+      </w:tr>
+      <w:tr>
+        <w:trPr>
+          <w:jc w:val="center"/>
+          <w:cantSplit/>
+        </w:trPr>
+        <w:tc>
+          <w:tcPr>
+            <w:tcW w:w="2900" w:type="dxa"/>
+          </w:tcPr>
+          <w:p>
+            <w:pPr>
+              <w:spacing w:after="20" w:before="20"/>
+            </w:pPr>
+            <w:r>
+              <w:rPr>
+                <w:rFonts w:ascii="Times New Roman" w:hAnsi="Times New Roman" w:cs="Times New Roman" w:eastAsia="Times New Roman"/>
+                <w:sz w:val="17"/>
+              </w:rPr>
+              <w:t xml:space="preserve">&lt;operador&gt;</w:t>
+            </w:r>
+          </w:p>
+        </w:tc>
+        <w:tc>
+          <w:tcPr>
+            <w:tcW w:w="1500" w:type="dxa"/>
+          </w:tcPr>
+          <w:p>
+            <w:pPr>
+              <w:spacing w:after="20" w:before="20"/>
+            </w:pPr>
+            <w:r>
+              <w:rPr>
+                <w:rFonts w:ascii="Courier New" w:hAnsi="Courier New" w:cs="Courier New" w:eastAsia="Courier New"/>
+                <w:sz w:val="17"/>
+              </w:rPr>
+              <w:t xml:space="preserve">M</w:t>
+            </w:r>
+          </w:p>
+        </w:tc>
+        <w:tc>
+          <w:tcPr>
+            <w:tcW w:w="2900" w:type="dxa"/>
+          </w:tcPr>
+          <w:p>
+            <w:pPr>
+              <w:spacing w:after="20" w:before="20"/>
+            </w:pPr>
+            <w:r>
+              <w:rPr>
+                <w:rFonts w:ascii="Times New Roman" w:hAnsi="Times New Roman" w:cs="Times New Roman" w:eastAsia="Times New Roman"/>
+                <w:sz w:val="17"/>
+              </w:rPr>
+              <w:t xml:space="preserve">entero (extensión)</w:t>
+            </w:r>
+          </w:p>
+        </w:tc>
+        <w:tc>
+          <w:tcPr>
+            <w:tcW w:w="1500" w:type="dxa"/>
+          </w:tcPr>
+          <w:p>
+            <w:pPr>
+              <w:spacing w:after="20" w:before="20"/>
+            </w:pPr>
+            <w:r>
+              <w:rPr>
+                <w:rFonts w:ascii="Courier New" w:hAnsi="Courier New" w:cs="Courier New" w:eastAsia="Courier New"/>
+                <w:sz w:val="17"/>
+              </w:rPr>
+              <w:t xml:space="preserve">t</w:t>
+            </w:r>
+          </w:p>
+        </w:tc>
+      </w:tr>
+      <w:tr>
+        <w:trPr>
+          <w:jc w:val="center"/>
+          <w:cantSplit/>
+        </w:trPr>
+        <w:tc>
+          <w:tcPr>
+            <w:tcW w:w="2900" w:type="dxa"/>
+          </w:tcPr>
+          <w:p>
+            <w:pPr>
+              <w:spacing w:after="20" w:before="20"/>
+            </w:pPr>
+            <w:r>
+              <w:rPr>
+                <w:rFonts w:ascii="Times New Roman" w:hAnsi="Times New Roman" w:cs="Times New Roman" w:eastAsia="Times New Roman"/>
+                <w:sz w:val="17"/>
+              </w:rPr>
+              <w:t xml:space="preserve">&lt;salida&gt;</w:t>
+            </w:r>
+          </w:p>
+        </w:tc>
+        <w:tc>
+          <w:tcPr>
+            <w:tcW w:w="1500" w:type="dxa"/>
+          </w:tcPr>
+          <w:p>
+            <w:pPr>
+              <w:spacing w:after="20" w:before="20"/>
+            </w:pPr>
+            <w:r>
+              <w:rPr>
+                <w:rFonts w:ascii="Courier New" w:hAnsi="Courier New" w:cs="Courier New" w:eastAsia="Courier New"/>
+                <w:sz w:val="17"/>
+              </w:rPr>
+              <w:t xml:space="preserve">C</w:t>
+            </w:r>
+          </w:p>
+        </w:tc>
+        <w:tc>
+          <w:tcPr>
+            <w:tcW w:w="2900" w:type="dxa"/>
+          </w:tcPr>
+          <w:p>
+            <w:pPr>
+              <w:spacing w:after="20" w:before="20"/>
+            </w:pPr>
+            <w:r>
+              <w:rPr>
+                <w:rFonts w:ascii="Times New Roman" w:hAnsi="Times New Roman" w:cs="Times New Roman" w:eastAsia="Times New Roman"/>
+                <w:sz w:val="17"/>
+              </w:rPr>
+              <w:t xml:space="preserve">real (extensión)</w:t>
+            </w:r>
+          </w:p>
+        </w:tc>
+        <w:tc>
+          <w:tcPr>
+            <w:tcW w:w="1500" w:type="dxa"/>
+          </w:tcPr>
+          <w:p>
+            <w:pPr>
+              <w:spacing w:after="20" w:before="20"/>
+            </w:pPr>
+            <w:r>
+              <w:rPr>
+                <w:rFonts w:ascii="Courier New" w:hAnsi="Courier New" w:cs="Courier New" w:eastAsia="Courier New"/>
+                <w:sz w:val="17"/>
+              </w:rPr>
+              <w:t xml:space="preserve">r</w:t>
+            </w:r>
+          </w:p>
+        </w:tc>
+      </w:tr>
+      <w:tr>
+        <w:trPr>
+          <w:jc w:val="center"/>
+          <w:cantSplit/>
+        </w:trPr>
+        <w:tc>
+          <w:tcPr>
+            <w:tcW w:w="2900" w:type="dxa"/>
+          </w:tcPr>
+          <w:p>
+            <w:pPr>
+              <w:spacing w:after="20" w:before="20"/>
+            </w:pPr>
+            <w:r>
+              <w:rPr>
+                <w:rFonts w:ascii="Times New Roman" w:hAnsi="Times New Roman" w:cs="Times New Roman" w:eastAsia="Times New Roman"/>
+                <w:sz w:val="17"/>
+              </w:rPr>
+              <w:t xml:space="preserve">&lt;declaracion&gt; (extensión)</w:t>
+            </w:r>
+          </w:p>
+        </w:tc>
+        <w:tc>
+          <w:tcPr>
+            <w:tcW w:w="1500" w:type="dxa"/>
+          </w:tcPr>
+          <w:p>
+            <w:pPr>
+              <w:spacing w:after="20" w:before="20"/>
+            </w:pPr>
+            <w:r>
+              <w:rPr>
+                <w:rFonts w:ascii="Courier New" w:hAnsi="Courier New" w:cs="Courier New" w:eastAsia="Courier New"/>
+                <w:sz w:val="17"/>
+              </w:rPr>
+              <w:t xml:space="preserve">D</w:t>
+            </w:r>
+          </w:p>
+        </w:tc>
+        <w:tc>
+          <w:tcPr>
+            <w:tcW w:w="2900" w:type="dxa"/>
+          </w:tcPr>
+          <w:p>
+            <w:pPr>
+              <w:spacing w:after="20" w:before="20"/>
+            </w:pPr>
+            <w:r>
+              <w:rPr>
+                <w:rFonts w:ascii="Times New Roman" w:hAnsi="Times New Roman" w:cs="Times New Roman" w:eastAsia="Times New Roman"/>
+                <w:sz w:val="17"/>
+              </w:rPr>
+              <w:t xml:space="preserve"/>
+            </w:r>
+          </w:p>
+        </w:tc>
+        <w:tc>
+          <w:tcPr>
+            <w:tcW w:w="1500" w:type="dxa"/>
+          </w:tcPr>
+          <w:p>
+            <w:pPr>
+              <w:spacing w:after="20" w:before="20"/>
+            </w:pPr>
+            <w:r>
+              <w:rPr>
+                <w:rFonts w:ascii="Courier New" w:hAnsi="Courier New" w:cs="Courier New" w:eastAsia="Courier New"/>
+                <w:sz w:val="17"/>
+              </w:rPr>
+              <w:t xml:space="preserve"/>
+            </w:r>
+          </w:p>
+        </w:tc>
+      </w:tr>
+      <w:tr>
+        <w:trPr>
+          <w:jc w:val="center"/>
+          <w:cantSplit/>
+        </w:trPr>
+        <w:tc>
+          <w:tcPr>
+            <w:tcW w:w="2900" w:type="dxa"/>
+          </w:tcPr>
+          <w:p>
+            <w:pPr>
+              <w:spacing w:after="20" w:before="20"/>
+            </w:pPr>
+            <w:r>
+              <w:rPr>
+                <w:rFonts w:ascii="Times New Roman" w:hAnsi="Times New Roman" w:cs="Times New Roman" w:eastAsia="Times New Roman"/>
+                <w:sz w:val="17"/>
+              </w:rPr>
+              <w:t xml:space="preserve">&lt;tipo&gt; (extensión)</w:t>
+            </w:r>
+          </w:p>
+        </w:tc>
+        <w:tc>
+          <w:tcPr>
+            <w:tcW w:w="1500" w:type="dxa"/>
+          </w:tcPr>
+          <w:p>
+            <w:pPr>
+              <w:spacing w:after="20" w:before="20"/>
+            </w:pPr>
+            <w:r>
+              <w:rPr>
+                <w:rFonts w:ascii="Courier New" w:hAnsi="Courier New" w:cs="Courier New" w:eastAsia="Courier New"/>
+                <w:sz w:val="17"/>
+              </w:rPr>
+              <w:t xml:space="preserve">Y</w:t>
+            </w:r>
+          </w:p>
+        </w:tc>
+        <w:tc>
+          <w:tcPr>
+            <w:tcW w:w="2900" w:type="dxa"/>
+          </w:tcPr>
+          <w:p>
+            <w:pPr>
+              <w:spacing w:after="20" w:before="20"/>
+            </w:pPr>
+            <w:r>
+              <w:rPr>
+                <w:rFonts w:ascii="Times New Roman" w:hAnsi="Times New Roman" w:cs="Times New Roman" w:eastAsia="Times New Roman"/>
+                <w:sz w:val="17"/>
+              </w:rPr>
+              <w:t xml:space="preserve"/>
+            </w:r>
+          </w:p>
+        </w:tc>
+        <w:tc>
+          <w:tcPr>
+            <w:tcW w:w="1500" w:type="dxa"/>
+          </w:tcPr>
+          <w:p>
+            <w:pPr>
+              <w:spacing w:after="20" w:before="20"/>
+            </w:pPr>
+            <w:r>
+              <w:rPr>
+                <w:rFonts w:ascii="Courier New" w:hAnsi="Courier New" w:cs="Courier New" w:eastAsia="Courier New"/>
+                <w:sz w:val="17"/>
+              </w:rPr>
+              <w:t xml:space="preserve"/>
+            </w:r>
+          </w:p>
+        </w:tc>
+      </w:tr>
+    </w:tbl>
+    <w:p>
+      <w:pPr>
+        <w:spacing w:after="40"/>
+      </w:pPr>
+    </w:p>
+    <w:p>
+      <w:pPr>
+        <w:keepNext/>
+        <w:spacing w:after="40"/>
+      </w:pPr>
+      <w:r>
+        <w:rPr>
+          <w:rFonts w:ascii="Times New Roman" w:hAnsi="Times New Roman" w:cs="Times New Roman" w:eastAsia="Times New Roman"/>
+          <w:b/>
+          <w:sz w:val="19"/>
+        </w:rPr>
+        <w:t xml:space="preserve">Producciones ingresadas (formato JFLAP; cada alternativa en una fila)</w:t>
+      </w:r>
+    </w:p>
+    <w:p>
+      <w:pPr>
+        <w:keepNext/>
+        <w:spacing w:after="20"/>
+      </w:pPr>
+      <w:r>
+        <w:rPr>
+          <w:rFonts w:ascii="Courier New" w:hAnsi="Courier New" w:cs="Courier New" w:eastAsia="Courier New"/>
+          <w:sz w:val="17"/>
+        </w:rPr>
+        <w:t xml:space="preserve">S → bpiLe      L → IL      L → I      I → A      I → R      I → C</w:t>
+      </w:r>
+    </w:p>
+    <w:p>
+      <w:pPr>
+        <w:keepNext/>
+        <w:spacing w:after="20"/>
+      </w:pPr>
+      <w:r>
+        <w:rPr>
+          <w:rFonts w:ascii="Courier New" w:hAnsi="Courier New" w:cs="Courier New" w:eastAsia="Courier New"/>
+          <w:sz w:val="17"/>
+        </w:rPr>
+        <w:t xml:space="preserve">A → i=O#      R → i=E#      E → OMO      O → i      O → n      C → oi#</w:t>
+      </w:r>
+    </w:p>
+    <w:p>
+      <w:pPr>
+        <w:keepNext/>
+        <w:spacing w:after="20"/>
+      </w:pPr>
+      <w:r>
+        <w:rPr>
+          <w:rFonts w:ascii="Courier New" w:hAnsi="Courier New" w:cs="Courier New" w:eastAsia="Courier New"/>
+          <w:sz w:val="17"/>
+        </w:rPr>
+        <w:t xml:space="preserve">M → +      M → -      M → *      M → /      M → %</w:t>
+      </w:r>
+    </w:p>
+    <w:p>
+      <w:pPr>
+        <w:spacing w:after="20"/>
+      </w:pPr>
+      <w:r>
+        <w:rPr>
+          <w:rFonts w:ascii="Courier New" w:hAnsi="Courier New" w:cs="Courier New" w:eastAsia="Courier New"/>
+          <w:sz w:val="17"/>
+        </w:rPr>
+        <w:t xml:space="preserve">Solo en lab3_extension.jff:  I → D      D → Yi#      Y → t      Y → r</w:t>
+      </w:r>
+    </w:p>
+    <w:p>
+      <w:pPr>
+        <w:spacing w:after="40"/>
+      </w:pPr>
+    </w:p>
+    <w:p>
+      <w:pPr>
+        <w:keepNext/>
+        <w:spacing w:after="40"/>
+      </w:pPr>
+      <w:r>
+        <w:rPr>
+          <w:rFonts w:ascii="Times New Roman" w:hAnsi="Times New Roman" w:cs="Times New Roman" w:eastAsia="Times New Roman"/>
+          <w:b/>
+          <w:sz w:val="19"/>
+        </w:rPr>
+        <w:t xml:space="preserve">Cadenas de prueba (Input → Multiple Brute Force Parse)</w:t>
+      </w:r>
+    </w:p>
+    <w:p>
+      <w:pPr>
+        <w:keepNext/>
+        <w:spacing w:after="40"/>
+      </w:pPr>
+      <w:r>
+        <w:rPr>
+          <w:rFonts w:ascii="Times New Roman" w:hAnsi="Times New Roman" w:cs="Times New Roman" w:eastAsia="Times New Roman"/>
+          <w:sz w:val="19"/>
+        </w:rPr>
+        <w:t xml:space="preserve">Cada cadena es la instrucción traducida y envuelta en bpi … e, es decir, Begin Programa prueba … End.</w:t>
+      </w:r>
+    </w:p>
+    <w:tbl>
+      <w:tblPr>
+        <w:tblStyle w:val="Tablaconcuadrcula"/>
+        <w:tblW w:w="0" w:type="auto"/>
+        <w:jc w:val="center"/>
+        <w:tblLook w:val="04A0" w:firstRow="1" w:lastRow="0" w:firstColumn="1" w:lastColumn="0" w:noHBand="0" w:noVBand="1"/>
+      </w:tblPr>
+      <w:tblGrid>
+        <w:gridCol w:w="2200"/>
+        <w:gridCol w:w="4200"/>
+        <w:gridCol w:w="1700"/>
+        <w:gridCol w:w="1836"/>
+      </w:tblGrid>
+      <w:tr>
+        <w:trPr>
+          <w:jc w:val="center"/>
+          <w:cantSplit/>
+          <w:tblHeader/>
+        </w:trPr>
+        <w:tc>
+          <w:tcPr>
+            <w:tcW w:w="2200" w:type="dxa"/>
+            <w:shd w:val="clear" w:color="auto" w:fill="D9EAF7"/>
+          </w:tcPr>
+          <w:p>
+            <w:pPr>
+              <w:spacing w:after="20" w:before="20"/>
+            </w:pPr>
+            <w:r>
+              <w:rPr>
+                <w:rFonts w:ascii="Times New Roman" w:hAnsi="Times New Roman" w:cs="Times New Roman" w:eastAsia="Times New Roman"/>
+                <w:b/>
+                <w:sz w:val="18"/>
+              </w:rPr>
+              <w:t xml:space="preserve">Cadena en JFLAP</w:t>
+            </w:r>
+          </w:p>
+        </w:tc>
+        <w:tc>
+          <w:tcPr>
+            <w:tcW w:w="4200" w:type="dxa"/>
+            <w:shd w:val="clear" w:color="auto" w:fill="D9EAF7"/>
+          </w:tcPr>
+          <w:p>
+            <w:pPr>
+              <w:spacing w:after="20" w:before="20"/>
+            </w:pPr>
+            <w:r>
+              <w:rPr>
+                <w:rFonts w:ascii="Times New Roman" w:hAnsi="Times New Roman" w:cs="Times New Roman" w:eastAsia="Times New Roman"/>
+                <w:b/>
+                <w:sz w:val="18"/>
+              </w:rPr>
+              <w:t xml:space="preserve">Corresponde a</w:t>
+            </w:r>
+          </w:p>
+        </w:tc>
+        <w:tc>
+          <w:tcPr>
+            <w:tcW w:w="1700" w:type="dxa"/>
+            <w:shd w:val="clear" w:color="auto" w:fill="D9EAF7"/>
+          </w:tcPr>
+          <w:p>
+            <w:pPr>
+              <w:spacing w:after="20" w:before="20"/>
+            </w:pPr>
+            <w:r>
+              <w:rPr>
+                <w:rFonts w:ascii="Times New Roman" w:hAnsi="Times New Roman" w:cs="Times New Roman" w:eastAsia="Times New Roman"/>
+                <w:b/>
+                <w:sz w:val="18"/>
+              </w:rPr>
+              <w:t xml:space="preserve">lab3_base.jff</w:t>
+            </w:r>
+          </w:p>
+        </w:tc>
+        <w:tc>
+          <w:tcPr>
+            <w:tcW w:w="1836" w:type="dxa"/>
+            <w:shd w:val="clear" w:color="auto" w:fill="D9EAF7"/>
+          </w:tcPr>
+          <w:p>
+            <w:pPr>
+              <w:spacing w:after="20" w:before="20"/>
+            </w:pPr>
+            <w:r>
+              <w:rPr>
+                <w:rFonts w:ascii="Times New Roman" w:hAnsi="Times New Roman" w:cs="Times New Roman" w:eastAsia="Times New Roman"/>
+                <w:b/>
+                <w:sz w:val="18"/>
+              </w:rPr>
+              <w:t xml:space="preserve">lab3_extension.jff</w:t>
+            </w:r>
+          </w:p>
+        </w:tc>
+      </w:tr>
+      <w:tr>
+        <w:trPr>
+          <w:jc w:val="center"/>
+          <w:cantSplit/>
+        </w:trPr>
+        <w:tc>
+          <w:tcPr>
+            <w:tcW w:w="2200" w:type="dxa"/>
+          </w:tcPr>
+          <w:p>
+            <w:pPr>
+              <w:spacing w:after="20" w:before="20"/>
+            </w:pPr>
+            <w:r>
+              <w:rPr>
+                <w:rFonts w:ascii="Courier New" w:hAnsi="Courier New" w:cs="Courier New" w:eastAsia="Courier New"/>
+                <w:sz w:val="17"/>
+              </w:rPr>
+              <w:t xml:space="preserve">bpii=n#e</w:t>
+            </w:r>
+          </w:p>
+        </w:tc>
+        <w:tc>
+          <w:tcPr>
+            <w:tcW w:w="4200" w:type="dxa"/>
+          </w:tcPr>
+          <w:p>
+            <w:pPr>
+              <w:spacing w:after="20" w:before="20"/>
+            </w:pPr>
+            <w:r>
+              <w:rPr>
+                <w:rFonts w:ascii="Times New Roman" w:hAnsi="Times New Roman" w:cs="Times New Roman" w:eastAsia="Times New Roman"/>
+                <w:sz w:val="17"/>
+              </w:rPr>
+              <w:t xml:space="preserve">Caso 1 x = 10 #  /  P3 x = 20 #</w:t>
+            </w:r>
+          </w:p>
+        </w:tc>
+        <w:tc>
+          <w:tcPr>
+            <w:tcW w:w="1700" w:type="dxa"/>
+          </w:tcPr>
+          <w:p>
+            <w:pPr>
+              <w:spacing w:after="20" w:before="20"/>
+            </w:pPr>
+            <w:r>
+              <w:rPr>
+                <w:rFonts w:ascii="Times New Roman" w:hAnsi="Times New Roman" w:cs="Times New Roman" w:eastAsia="Times New Roman"/>
+                <w:sz w:val="17"/>
+              </w:rPr>
+              <w:t xml:space="preserve">Accept</w:t>
+            </w:r>
+          </w:p>
+        </w:tc>
+        <w:tc>
+          <w:tcPr>
+            <w:tcW w:w="1836" w:type="dxa"/>
+          </w:tcPr>
+          <w:p>
+            <w:pPr>
+              <w:spacing w:after="20" w:before="20"/>
+            </w:pPr>
+            <w:r>
+              <w:rPr>
+                <w:rFonts w:ascii="Times New Roman" w:hAnsi="Times New Roman" w:cs="Times New Roman" w:eastAsia="Times New Roman"/>
+                <w:sz w:val="17"/>
+              </w:rPr>
+              <w:t xml:space="preserve">Accept</w:t>
+            </w:r>
+          </w:p>
+        </w:tc>
+      </w:tr>
+      <w:tr>
+        <w:trPr>
+          <w:jc w:val="center"/>
+          <w:cantSplit/>
+        </w:trPr>
+        <w:tc>
+          <w:tcPr>
+            <w:tcW w:w="2200" w:type="dxa"/>
+          </w:tcPr>
+          <w:p>
+            <w:pPr>
+              <w:spacing w:after="20" w:before="20"/>
+            </w:pPr>
+            <w:r>
+              <w:rPr>
+                <w:rFonts w:ascii="Courier New" w:hAnsi="Courier New" w:cs="Courier New" w:eastAsia="Courier New"/>
+                <w:sz w:val="17"/>
+              </w:rPr>
+              <w:t xml:space="preserve">bpii=i+i#e</w:t>
+            </w:r>
+          </w:p>
+        </w:tc>
+        <w:tc>
+          <w:tcPr>
+            <w:tcW w:w="4200" w:type="dxa"/>
+          </w:tcPr>
+          <w:p>
+            <w:pPr>
+              <w:spacing w:after="20" w:before="20"/>
+            </w:pPr>
+            <w:r>
+              <w:rPr>
+                <w:rFonts w:ascii="Times New Roman" w:hAnsi="Times New Roman" w:cs="Times New Roman" w:eastAsia="Times New Roman"/>
+                <w:sz w:val="17"/>
+              </w:rPr>
+              <w:t xml:space="preserve">Caso 2 z = x + y #</w:t>
+            </w:r>
+          </w:p>
+        </w:tc>
+        <w:tc>
+          <w:tcPr>
+            <w:tcW w:w="1700" w:type="dxa"/>
+          </w:tcPr>
+          <w:p>
+            <w:pPr>
+              <w:spacing w:after="20" w:before="20"/>
+            </w:pPr>
+            <w:r>
+              <w:rPr>
+                <w:rFonts w:ascii="Times New Roman" w:hAnsi="Times New Roman" w:cs="Times New Roman" w:eastAsia="Times New Roman"/>
+                <w:sz w:val="17"/>
+              </w:rPr>
+              <w:t xml:space="preserve">Accept</w:t>
+            </w:r>
+          </w:p>
+        </w:tc>
+        <w:tc>
+          <w:tcPr>
+            <w:tcW w:w="1836" w:type="dxa"/>
+          </w:tcPr>
+          <w:p>
+            <w:pPr>
+              <w:spacing w:after="20" w:before="20"/>
+            </w:pPr>
+            <w:r>
+              <w:rPr>
+                <w:rFonts w:ascii="Times New Roman" w:hAnsi="Times New Roman" w:cs="Times New Roman" w:eastAsia="Times New Roman"/>
+                <w:sz w:val="17"/>
+              </w:rPr>
+              <w:t xml:space="preserve">Accept</w:t>
+            </w:r>
+          </w:p>
+        </w:tc>
+      </w:tr>
+      <w:tr>
+        <w:trPr>
+          <w:jc w:val="center"/>
+          <w:cantSplit/>
+        </w:trPr>
+        <w:tc>
+          <w:tcPr>
+            <w:tcW w:w="2200" w:type="dxa"/>
+          </w:tcPr>
+          <w:p>
+            <w:pPr>
+              <w:spacing w:after="20" w:before="20"/>
+            </w:pPr>
+            <w:r>
+              <w:rPr>
+                <w:rFonts w:ascii="Courier New" w:hAnsi="Courier New" w:cs="Courier New" w:eastAsia="Courier New"/>
+                <w:sz w:val="17"/>
+              </w:rPr>
+              <w:t xml:space="preserve">bpioi#e</w:t>
+            </w:r>
+          </w:p>
+        </w:tc>
+        <w:tc>
+          <w:tcPr>
+            <w:tcW w:w="4200" w:type="dxa"/>
+          </w:tcPr>
+          <w:p>
+            <w:pPr>
+              <w:spacing w:after="20" w:before="20"/>
+            </w:pPr>
+            <w:r>
+              <w:rPr>
+                <w:rFonts w:ascii="Times New Roman" w:hAnsi="Times New Roman" w:cs="Times New Roman" w:eastAsia="Times New Roman"/>
+                <w:sz w:val="17"/>
+              </w:rPr>
+              <w:t xml:space="preserve">Caso 3 salida z #  /  P3 salida temporal #</w:t>
+            </w:r>
+          </w:p>
+        </w:tc>
+        <w:tc>
+          <w:tcPr>
+            <w:tcW w:w="1700" w:type="dxa"/>
+          </w:tcPr>
+          <w:p>
+            <w:pPr>
+              <w:spacing w:after="20" w:before="20"/>
+            </w:pPr>
+            <w:r>
+              <w:rPr>
+                <w:rFonts w:ascii="Times New Roman" w:hAnsi="Times New Roman" w:cs="Times New Roman" w:eastAsia="Times New Roman"/>
+                <w:sz w:val="17"/>
+              </w:rPr>
+              <w:t xml:space="preserve">Accept</w:t>
+            </w:r>
+          </w:p>
+        </w:tc>
+        <w:tc>
+          <w:tcPr>
+            <w:tcW w:w="1836" w:type="dxa"/>
+          </w:tcPr>
+          <w:p>
+            <w:pPr>
+              <w:spacing w:after="20" w:before="20"/>
+            </w:pPr>
+            <w:r>
+              <w:rPr>
+                <w:rFonts w:ascii="Times New Roman" w:hAnsi="Times New Roman" w:cs="Times New Roman" w:eastAsia="Times New Roman"/>
+                <w:sz w:val="17"/>
+              </w:rPr>
+              <w:t xml:space="preserve">Accept</w:t>
+            </w:r>
+          </w:p>
+        </w:tc>
+      </w:tr>
+      <w:tr>
+        <w:trPr>
+          <w:jc w:val="center"/>
+          <w:cantSplit/>
+        </w:trPr>
+        <w:tc>
+          <w:tcPr>
+            <w:tcW w:w="2200" w:type="dxa"/>
+          </w:tcPr>
+          <w:p>
+            <w:pPr>
+              <w:spacing w:after="20" w:before="20"/>
+            </w:pPr>
+            <w:r>
+              <w:rPr>
+                <w:rFonts w:ascii="Courier New" w:hAnsi="Courier New" w:cs="Courier New" w:eastAsia="Courier New"/>
+                <w:sz w:val="17"/>
+              </w:rPr>
+              <w:t xml:space="preserve">bpiin#e</w:t>
+            </w:r>
+          </w:p>
+        </w:tc>
+        <w:tc>
+          <w:tcPr>
+            <w:tcW w:w="4200" w:type="dxa"/>
+          </w:tcPr>
+          <w:p>
+            <w:pPr>
+              <w:spacing w:after="20" w:before="20"/>
+            </w:pPr>
+            <w:r>
+              <w:rPr>
+                <w:rFonts w:ascii="Times New Roman" w:hAnsi="Times New Roman" w:cs="Times New Roman" w:eastAsia="Times New Roman"/>
+                <w:sz w:val="17"/>
+              </w:rPr>
+              <w:t xml:space="preserve">Caso 4 x 10 #</w:t>
+            </w:r>
+          </w:p>
+        </w:tc>
+        <w:tc>
+          <w:tcPr>
+            <w:tcW w:w="1700" w:type="dxa"/>
+          </w:tcPr>
+          <w:p>
+            <w:pPr>
+              <w:spacing w:after="20" w:before="20"/>
+            </w:pPr>
+            <w:r>
+              <w:rPr>
+                <w:rFonts w:ascii="Times New Roman" w:hAnsi="Times New Roman" w:cs="Times New Roman" w:eastAsia="Times New Roman"/>
+                <w:sz w:val="17"/>
+              </w:rPr>
+              <w:t xml:space="preserve">Reject</w:t>
+            </w:r>
+          </w:p>
+        </w:tc>
+        <w:tc>
+          <w:tcPr>
+            <w:tcW w:w="1836" w:type="dxa"/>
+          </w:tcPr>
+          <w:p>
+            <w:pPr>
+              <w:spacing w:after="20" w:before="20"/>
+            </w:pPr>
+            <w:r>
+              <w:rPr>
+                <w:rFonts w:ascii="Times New Roman" w:hAnsi="Times New Roman" w:cs="Times New Roman" w:eastAsia="Times New Roman"/>
+                <w:sz w:val="17"/>
+              </w:rPr>
+              <w:t xml:space="preserve">Reject</w:t>
+            </w:r>
+          </w:p>
+        </w:tc>
+      </w:tr>
+      <w:tr>
+        <w:trPr>
+          <w:jc w:val="center"/>
+          <w:cantSplit/>
+        </w:trPr>
+        <w:tc>
+          <w:tcPr>
+            <w:tcW w:w="2200" w:type="dxa"/>
+          </w:tcPr>
+          <w:p>
+            <w:pPr>
+              <w:spacing w:after="20" w:before="20"/>
+            </w:pPr>
+            <w:r>
+              <w:rPr>
+                <w:rFonts w:ascii="Courier New" w:hAnsi="Courier New" w:cs="Courier New" w:eastAsia="Courier New"/>
+                <w:sz w:val="17"/>
+              </w:rPr>
+              <w:t xml:space="preserve">bpii=+ii#e</w:t>
+            </w:r>
+          </w:p>
+        </w:tc>
+        <w:tc>
+          <w:tcPr>
+            <w:tcW w:w="4200" w:type="dxa"/>
+          </w:tcPr>
+          <w:p>
+            <w:pPr>
+              <w:spacing w:after="20" w:before="20"/>
+            </w:pPr>
+            <w:r>
+              <w:rPr>
+                <w:rFonts w:ascii="Times New Roman" w:hAnsi="Times New Roman" w:cs="Times New Roman" w:eastAsia="Times New Roman"/>
+                <w:sz w:val="17"/>
+              </w:rPr>
+              <w:t xml:space="preserve">Caso 5 z = + x y #</w:t>
+            </w:r>
+          </w:p>
+        </w:tc>
+        <w:tc>
+          <w:tcPr>
+            <w:tcW w:w="1700" w:type="dxa"/>
+          </w:tcPr>
+          <w:p>
+            <w:pPr>
+              <w:spacing w:after="20" w:before="20"/>
+            </w:pPr>
+            <w:r>
+              <w:rPr>
+                <w:rFonts w:ascii="Times New Roman" w:hAnsi="Times New Roman" w:cs="Times New Roman" w:eastAsia="Times New Roman"/>
+                <w:sz w:val="17"/>
+              </w:rPr>
+              <w:t xml:space="preserve">Reject</w:t>
+            </w:r>
+          </w:p>
+        </w:tc>
+        <w:tc>
+          <w:tcPr>
+            <w:tcW w:w="1836" w:type="dxa"/>
+          </w:tcPr>
+          <w:p>
+            <w:pPr>
+              <w:spacing w:after="20" w:before="20"/>
+            </w:pPr>
+            <w:r>
+              <w:rPr>
+                <w:rFonts w:ascii="Times New Roman" w:hAnsi="Times New Roman" w:cs="Times New Roman" w:eastAsia="Times New Roman"/>
+                <w:sz w:val="17"/>
+              </w:rPr>
+              <w:t xml:space="preserve">Reject</w:t>
+            </w:r>
+          </w:p>
+        </w:tc>
+      </w:tr>
+      <w:tr>
+        <w:trPr>
+          <w:jc w:val="center"/>
+          <w:cantSplit/>
+        </w:trPr>
+        <w:tc>
+          <w:tcPr>
+            <w:tcW w:w="2200" w:type="dxa"/>
+          </w:tcPr>
+          <w:p>
+            <w:pPr>
+              <w:spacing w:after="20" w:before="20"/>
+            </w:pPr>
+            <w:r>
+              <w:rPr>
+                <w:rFonts w:ascii="Courier New" w:hAnsi="Courier New" w:cs="Courier New" w:eastAsia="Courier New"/>
+                <w:sz w:val="17"/>
+              </w:rPr>
+              <w:t xml:space="preserve">bpio#e</w:t>
+            </w:r>
+          </w:p>
+        </w:tc>
+        <w:tc>
+          <w:tcPr>
+            <w:tcW w:w="4200" w:type="dxa"/>
+          </w:tcPr>
+          <w:p>
+            <w:pPr>
+              <w:spacing w:after="20" w:before="20"/>
+            </w:pPr>
+            <w:r>
+              <w:rPr>
+                <w:rFonts w:ascii="Times New Roman" w:hAnsi="Times New Roman" w:cs="Times New Roman" w:eastAsia="Times New Roman"/>
+                <w:sz w:val="17"/>
+              </w:rPr>
+              <w:t xml:space="preserve">Caso 6 salida #</w:t>
+            </w:r>
+          </w:p>
+        </w:tc>
+        <w:tc>
+          <w:tcPr>
+            <w:tcW w:w="1700" w:type="dxa"/>
+          </w:tcPr>
+          <w:p>
+            <w:pPr>
+              <w:spacing w:after="20" w:before="20"/>
+            </w:pPr>
+            <w:r>
+              <w:rPr>
+                <w:rFonts w:ascii="Times New Roman" w:hAnsi="Times New Roman" w:cs="Times New Roman" w:eastAsia="Times New Roman"/>
+                <w:sz w:val="17"/>
+              </w:rPr>
+              <w:t xml:space="preserve">Reject</w:t>
+            </w:r>
+          </w:p>
+        </w:tc>
+        <w:tc>
+          <w:tcPr>
+            <w:tcW w:w="1836" w:type="dxa"/>
+          </w:tcPr>
+          <w:p>
+            <w:pPr>
+              <w:spacing w:after="20" w:before="20"/>
+            </w:pPr>
+            <w:r>
+              <w:rPr>
+                <w:rFonts w:ascii="Times New Roman" w:hAnsi="Times New Roman" w:cs="Times New Roman" w:eastAsia="Times New Roman"/>
+                <w:sz w:val="17"/>
+              </w:rPr>
+              <w:t xml:space="preserve">Reject</w:t>
+            </w:r>
+          </w:p>
+        </w:tc>
+      </w:tr>
+      <w:tr>
+        <w:trPr>
+          <w:jc w:val="center"/>
+          <w:cantSplit/>
+        </w:trPr>
+        <w:tc>
+          <w:tcPr>
+            <w:tcW w:w="2200" w:type="dxa"/>
+          </w:tcPr>
+          <w:p>
+            <w:pPr>
+              <w:spacing w:after="20" w:before="20"/>
+            </w:pPr>
+            <w:r>
+              <w:rPr>
+                <w:rFonts w:ascii="Courier New" w:hAnsi="Courier New" w:cs="Courier New" w:eastAsia="Courier New"/>
+                <w:sz w:val="17"/>
+              </w:rPr>
+              <w:t xml:space="preserve">bpii=ne</w:t>
+            </w:r>
+          </w:p>
+        </w:tc>
+        <w:tc>
+          <w:tcPr>
+            <w:tcW w:w="4200" w:type="dxa"/>
+          </w:tcPr>
+          <w:p>
+            <w:pPr>
+              <w:spacing w:after="20" w:before="20"/>
+            </w:pPr>
+            <w:r>
+              <w:rPr>
+                <w:rFonts w:ascii="Times New Roman" w:hAnsi="Times New Roman" w:cs="Times New Roman" w:eastAsia="Times New Roman"/>
+                <w:sz w:val="17"/>
+              </w:rPr>
+              <w:t xml:space="preserve">Caso 7 x = 20</w:t>
+            </w:r>
+          </w:p>
+        </w:tc>
+        <w:tc>
+          <w:tcPr>
+            <w:tcW w:w="1700" w:type="dxa"/>
+          </w:tcPr>
+          <w:p>
+            <w:pPr>
+              <w:spacing w:after="20" w:before="20"/>
+            </w:pPr>
+            <w:r>
+              <w:rPr>
+                <w:rFonts w:ascii="Times New Roman" w:hAnsi="Times New Roman" w:cs="Times New Roman" w:eastAsia="Times New Roman"/>
+                <w:sz w:val="17"/>
+              </w:rPr>
+              <w:t xml:space="preserve">Reject</w:t>
+            </w:r>
+          </w:p>
+        </w:tc>
+        <w:tc>
+          <w:tcPr>
+            <w:tcW w:w="1836" w:type="dxa"/>
+          </w:tcPr>
+          <w:p>
+            <w:pPr>
+              <w:spacing w:after="20" w:before="20"/>
+            </w:pPr>
+            <w:r>
+              <w:rPr>
+                <w:rFonts w:ascii="Times New Roman" w:hAnsi="Times New Roman" w:cs="Times New Roman" w:eastAsia="Times New Roman"/>
+                <w:sz w:val="17"/>
+              </w:rPr>
+              <w:t xml:space="preserve">Reject</w:t>
+            </w:r>
+          </w:p>
+        </w:tc>
+      </w:tr>
+      <w:tr>
+        <w:trPr>
+          <w:jc w:val="center"/>
+          <w:cantSplit/>
+        </w:trPr>
+        <w:tc>
+          <w:tcPr>
+            <w:tcW w:w="2200" w:type="dxa"/>
+          </w:tcPr>
+          <w:p>
+            <w:pPr>
+              <w:spacing w:after="20" w:before="20"/>
+            </w:pPr>
+            <w:r>
+              <w:rPr>
+                <w:rFonts w:ascii="Courier New" w:hAnsi="Courier New" w:cs="Courier New" w:eastAsia="Courier New"/>
+                <w:sz w:val="17"/>
+              </w:rPr>
+              <w:t xml:space="preserve">bpii=n#oi#e</w:t>
+            </w:r>
+          </w:p>
+        </w:tc>
+        <w:tc>
+          <w:tcPr>
+            <w:tcW w:w="4200" w:type="dxa"/>
+          </w:tcPr>
+          <w:p>
+            <w:pPr>
+              <w:spacing w:after="20" w:before="20"/>
+            </w:pPr>
+            <w:r>
+              <w:rPr>
+                <w:rFonts w:ascii="Times New Roman" w:hAnsi="Times New Roman" w:cs="Times New Roman" w:eastAsia="Times New Roman"/>
+                <w:sz w:val="17"/>
+              </w:rPr>
+              <w:t xml:space="preserve">Caso 8 (programa completo)</w:t>
+            </w:r>
+          </w:p>
+        </w:tc>
+        <w:tc>
+          <w:tcPr>
+            <w:tcW w:w="1700" w:type="dxa"/>
+          </w:tcPr>
+          <w:p>
+            <w:pPr>
+              <w:spacing w:after="20" w:before="20"/>
+            </w:pPr>
+            <w:r>
+              <w:rPr>
+                <w:rFonts w:ascii="Times New Roman" w:hAnsi="Times New Roman" w:cs="Times New Roman" w:eastAsia="Times New Roman"/>
+                <w:sz w:val="17"/>
+              </w:rPr>
+              <w:t xml:space="preserve">Accept</w:t>
+            </w:r>
+          </w:p>
+        </w:tc>
+        <w:tc>
+          <w:tcPr>
+            <w:tcW w:w="1836" w:type="dxa"/>
+          </w:tcPr>
+          <w:p>
+            <w:pPr>
+              <w:spacing w:after="20" w:before="20"/>
+            </w:pPr>
+            <w:r>
+              <w:rPr>
+                <w:rFonts w:ascii="Times New Roman" w:hAnsi="Times New Roman" w:cs="Times New Roman" w:eastAsia="Times New Roman"/>
+                <w:sz w:val="17"/>
+              </w:rPr>
+              <w:t xml:space="preserve">Accept</w:t>
+            </w:r>
+          </w:p>
+        </w:tc>
+      </w:tr>
+      <w:tr>
+        <w:trPr>
+          <w:jc w:val="center"/>
+          <w:cantSplit/>
+        </w:trPr>
+        <w:tc>
+          <w:tcPr>
+            <w:tcW w:w="2200" w:type="dxa"/>
+          </w:tcPr>
+          <w:p>
+            <w:pPr>
+              <w:spacing w:after="20" w:before="20"/>
+            </w:pPr>
+            <w:r>
+              <w:rPr>
+                <w:rFonts w:ascii="Courier New" w:hAnsi="Courier New" w:cs="Courier New" w:eastAsia="Courier New"/>
+                <w:sz w:val="17"/>
+              </w:rPr>
+              <w:t xml:space="preserve">bpii=i*i#e</w:t>
+            </w:r>
+          </w:p>
+        </w:tc>
+        <w:tc>
+          <w:tcPr>
+            <w:tcW w:w="4200" w:type="dxa"/>
+          </w:tcPr>
+          <w:p>
+            <w:pPr>
+              <w:spacing w:after="20" w:before="20"/>
+            </w:pPr>
+            <w:r>
+              <w:rPr>
+                <w:rFonts w:ascii="Times New Roman" w:hAnsi="Times New Roman" w:cs="Times New Roman" w:eastAsia="Times New Roman"/>
+                <w:sz w:val="17"/>
+              </w:rPr>
+              <w:t xml:space="preserve">P3 z = x * y #</w:t>
+            </w:r>
+          </w:p>
+        </w:tc>
+        <w:tc>
+          <w:tcPr>
+            <w:tcW w:w="1700" w:type="dxa"/>
+          </w:tcPr>
+          <w:p>
+            <w:pPr>
+              <w:spacing w:after="20" w:before="20"/>
+            </w:pPr>
+            <w:r>
+              <w:rPr>
+                <w:rFonts w:ascii="Times New Roman" w:hAnsi="Times New Roman" w:cs="Times New Roman" w:eastAsia="Times New Roman"/>
+                <w:sz w:val="17"/>
+              </w:rPr>
+              <w:t xml:space="preserve">Accept</w:t>
+            </w:r>
+          </w:p>
+        </w:tc>
+        <w:tc>
+          <w:tcPr>
+            <w:tcW w:w="1836" w:type="dxa"/>
+          </w:tcPr>
+          <w:p>
+            <w:pPr>
+              <w:spacing w:after="20" w:before="20"/>
+            </w:pPr>
+            <w:r>
+              <w:rPr>
+                <w:rFonts w:ascii="Times New Roman" w:hAnsi="Times New Roman" w:cs="Times New Roman" w:eastAsia="Times New Roman"/>
+                <w:sz w:val="17"/>
+              </w:rPr>
+              <w:t xml:space="preserve">Accept</w:t>
+            </w:r>
+          </w:p>
+        </w:tc>
+      </w:tr>
+      <w:tr>
+        <w:trPr>
+          <w:jc w:val="center"/>
+          <w:cantSplit/>
+        </w:trPr>
+        <w:tc>
+          <w:tcPr>
+            <w:tcW w:w="2200" w:type="dxa"/>
+          </w:tcPr>
+          <w:p>
+            <w:pPr>
+              <w:spacing w:after="20" w:before="20"/>
+            </w:pPr>
+            <w:r>
+              <w:rPr>
+                <w:rFonts w:ascii="Courier New" w:hAnsi="Courier New" w:cs="Courier New" w:eastAsia="Courier New"/>
+                <w:sz w:val="17"/>
+              </w:rPr>
+              <w:t xml:space="preserve">bpiti#e</w:t>
+            </w:r>
+          </w:p>
+        </w:tc>
+        <w:tc>
+          <w:tcPr>
+            <w:tcW w:w="4200" w:type="dxa"/>
+          </w:tcPr>
+          <w:p>
+            <w:pPr>
+              <w:spacing w:after="20" w:before="20"/>
+            </w:pPr>
+            <w:r>
+              <w:rPr>
+                <w:rFonts w:ascii="Times New Roman" w:hAnsi="Times New Roman" w:cs="Times New Roman" w:eastAsia="Times New Roman"/>
+                <w:sz w:val="17"/>
+              </w:rPr>
+              <w:t xml:space="preserve">Extensión válida: entero edad #</w:t>
+            </w:r>
+          </w:p>
+        </w:tc>
+        <w:tc>
+          <w:tcPr>
+            <w:tcW w:w="1700" w:type="dxa"/>
+          </w:tcPr>
+          <w:p>
+            <w:pPr>
+              <w:spacing w:after="20" w:before="20"/>
+            </w:pPr>
+            <w:r>
+              <w:rPr>
+                <w:rFonts w:ascii="Times New Roman" w:hAnsi="Times New Roman" w:cs="Times New Roman" w:eastAsia="Times New Roman"/>
+                <w:sz w:val="17"/>
+              </w:rPr>
+              <w:t xml:space="preserve">Reject</w:t>
+            </w:r>
+          </w:p>
+        </w:tc>
+        <w:tc>
+          <w:tcPr>
+            <w:tcW w:w="1836" w:type="dxa"/>
+          </w:tcPr>
+          <w:p>
+            <w:pPr>
+              <w:spacing w:after="20" w:before="20"/>
+            </w:pPr>
+            <w:r>
+              <w:rPr>
+                <w:rFonts w:ascii="Times New Roman" w:hAnsi="Times New Roman" w:cs="Times New Roman" w:eastAsia="Times New Roman"/>
+                <w:sz w:val="17"/>
+              </w:rPr>
+              <w:t xml:space="preserve">Accept</w:t>
+            </w:r>
+          </w:p>
+        </w:tc>
+      </w:tr>
+      <w:tr>
+        <w:trPr>
+          <w:jc w:val="center"/>
+          <w:cantSplit/>
+        </w:trPr>
+        <w:tc>
+          <w:tcPr>
+            <w:tcW w:w="2200" w:type="dxa"/>
+          </w:tcPr>
+          <w:p>
+            <w:pPr>
+              <w:spacing w:after="20" w:before="20"/>
+            </w:pPr>
+            <w:r>
+              <w:rPr>
+                <w:rFonts w:ascii="Courier New" w:hAnsi="Courier New" w:cs="Courier New" w:eastAsia="Courier New"/>
+                <w:sz w:val="17"/>
+              </w:rPr>
+              <w:t xml:space="preserve">bpit#e</w:t>
+            </w:r>
+          </w:p>
+        </w:tc>
+        <w:tc>
+          <w:tcPr>
+            <w:tcW w:w="4200" w:type="dxa"/>
+          </w:tcPr>
+          <w:p>
+            <w:pPr>
+              <w:spacing w:after="20" w:before="20"/>
+            </w:pPr>
+            <w:r>
+              <w:rPr>
+                <w:rFonts w:ascii="Times New Roman" w:hAnsi="Times New Roman" w:cs="Times New Roman" w:eastAsia="Times New Roman"/>
+                <w:sz w:val="17"/>
+              </w:rPr>
+              <w:t xml:space="preserve">Extensión inválida: entero #</w:t>
+            </w:r>
+          </w:p>
+        </w:tc>
+        <w:tc>
+          <w:tcPr>
+            <w:tcW w:w="1700" w:type="dxa"/>
+          </w:tcPr>
+          <w:p>
+            <w:pPr>
+              <w:spacing w:after="20" w:before="20"/>
+            </w:pPr>
+            <w:r>
+              <w:rPr>
+                <w:rFonts w:ascii="Times New Roman" w:hAnsi="Times New Roman" w:cs="Times New Roman" w:eastAsia="Times New Roman"/>
+                <w:sz w:val="17"/>
+              </w:rPr>
+              <w:t xml:space="preserve">Reject</w:t>
+            </w:r>
+          </w:p>
+        </w:tc>
+        <w:tc>
+          <w:tcPr>
+            <w:tcW w:w="1836" w:type="dxa"/>
+          </w:tcPr>
+          <w:p>
+            <w:pPr>
+              <w:spacing w:after="20" w:before="20"/>
+            </w:pPr>
+            <w:r>
+              <w:rPr>
+                <w:rFonts w:ascii="Times New Roman" w:hAnsi="Times New Roman" w:cs="Times New Roman" w:eastAsia="Times New Roman"/>
+                <w:sz w:val="17"/>
+              </w:rPr>
+              <w:t xml:space="preserve">Reject</w:t>
+            </w:r>
+          </w:p>
+        </w:tc>
+      </w:tr>
+    </w:tbl>
+    <w:p>
+      <w:pPr>
+        <w:spacing w:after="60" w:before="60"/>
+      </w:pPr>
+      <w:r>
+        <w:rPr>
+          <w:rFonts w:ascii="Times New Roman" w:hAnsi="Times New Roman" w:cs="Times New Roman" w:eastAsia="Times New Roman"/>
+          <w:sz w:val="19"/>
+        </w:rPr>
+        <w:t xml:space="preserve">Los resultados de lab3_extension.jff son los que muestra JFLAP en la Figura 5. Los de lab3_base.jff se obtienen de la misma gramática sin las cuatro producciones de la extensión: ninguna produce t ni r, por lo que bpiti#e no puede derivarse y se rechaza, mientras que los casos 1 a 8 y las cadenas de la Pregunta 3 no cambian. Esto muestra que la extensión amplía el lenguaje sin alterar la gramática base.</w:t>
+      </w:r>
+    </w:p>
+    <w:p>
+      <w:pPr>
+        <w:keepNext/>
+        <w:spacing w:after="0"/>
+        <w:jc w:val="center"/>
+      </w:pPr>
+      <w:r>
+        <w:drawing>
+          <wp:inline xmlns:a="http://schemas.openxmlformats.org/drawingml/2006/main" xmlns:pic="http://schemas.openxmlformats.org/drawingml/2006/picture">
+            <wp:extent cx="6035040" cy="2920944"/>
+            <wp:docPr id="4" name="Picture 4"/>
+            <wp:cNvGraphicFramePr>
+              <a:graphicFrameLocks noChangeAspect="1"/>
+            </wp:cNvGraphicFramePr>
+            <a:graphic>
+              <a:graphicData uri="http://schemas.openxmlformats.org/drawingml/2006/picture">
+                <pic:pic>
+                  <pic:nvPicPr>
+                    <pic:cNvPr id="0" name="arbol_salida_z.jpg"/>
+                    <pic:cNvPicPr/>
+                  </pic:nvPicPr>
+                  <pic:blipFill>
+                    <a:blip r:embed="rId14"/>
+                    <a:stretch>
+                      <a:fillRect/>
+                    </a:stretch>
+                  </pic:blipFill>
+                  <pic:spPr>
+                    <a:xfrm>
+                      <a:off x="0" y="0"/>
+                      <a:ext cx="6035040" cy="2920944"/>
+                    </a:xfrm>
+                    <a:prstGeom prst="rect"/>
+                  </pic:spPr>
+                </pic:pic>
+              </a:graphicData>
+            </a:graphic>
+          </wp:inline>
+        </w:drawing>
+      </w:r>
+    </w:p>
+    <w:p>
+      <w:pPr>
+        <w:spacing w:after="120"/>
+        <w:jc w:val="center"/>
+      </w:pPr>
+      <w:r>
+        <w:rPr>
+          <w:rFonts w:ascii="Times New Roman" w:hAnsi="Times New Roman" w:cs="Times New Roman" w:eastAsia="Times New Roman"/>
+          <w:b/>
+          <w:sz w:val="18"/>
+        </w:rPr>
+        <w:t xml:space="preserve">Figura 4. </w:t>
+      </w:r>
+      <w:r>
+        <w:rPr>
+          <w:rFonts w:ascii="Times New Roman" w:hAnsi="Times New Roman" w:cs="Times New Roman" w:eastAsia="Times New Roman"/>
+          <w:sz w:val="18"/>
+        </w:rPr>
+        <w:t xml:space="preserve">Árbol de derivación de salida z # (cadena bpioi#e) en JFLAP, resultado «String Accepted!»: S → b p i L e, L → I, I → C, C → o i #.</w:t>
+      </w:r>
+    </w:p>
+    <w:p>
+      <w:pPr>
+        <w:keepNext/>
+        <w:spacing w:after="0"/>
+        <w:jc w:val="center"/>
+      </w:pPr>
+      <w:r>
+        <w:drawing>
+          <wp:inline xmlns:a="http://schemas.openxmlformats.org/drawingml/2006/main" xmlns:pic="http://schemas.openxmlformats.org/drawingml/2006/picture">
+            <wp:extent cx="6035040" cy="2920944"/>
+            <wp:docPr id="4" name="Picture 4"/>
+            <wp:cNvGraphicFramePr>
+              <a:graphicFrameLocks noChangeAspect="1"/>
+            </wp:cNvGraphicFramePr>
+            <a:graphic>
+              <a:graphicData uri="http://schemas.openxmlformats.org/drawingml/2006/picture">
+                <pic:pic>
+                  <pic:nvPicPr>
+                    <pic:cNvPr id="0" name="multiple_brute_force.jpg"/>
+                    <pic:cNvPicPr/>
+                  </pic:nvPicPr>
+                  <pic:blipFill>
+                    <a:blip r:embed="rId15"/>
+                    <a:stretch>
+                      <a:fillRect/>
+                    </a:stretch>
+                  </pic:blipFill>
+                  <pic:spPr>
+                    <a:xfrm>
+                      <a:off x="0" y="0"/>
+                      <a:ext cx="6035040" cy="2920944"/>
+                    </a:xfrm>
+                    <a:prstGeom prst="rect"/>
+                  </pic:spPr>
+                </pic:pic>
+              </a:graphicData>
+            </a:graphic>
+          </wp:inline>
+        </w:drawing>
+      </w:r>
+    </w:p>
+    <w:p>
+      <w:pPr>
+        <w:spacing w:after="120"/>
+        <w:jc w:val="center"/>
+      </w:pPr>
+      <w:r>
+        <w:rPr>
+          <w:rFonts w:ascii="Times New Roman" w:hAnsi="Times New Roman" w:cs="Times New Roman" w:eastAsia="Times New Roman"/>
+          <w:b/>
+          <w:sz w:val="18"/>
+        </w:rPr>
+        <w:t xml:space="preserve">Figura 5. </w:t>
+      </w:r>
+      <w:r>
+        <w:rPr>
+          <w:rFonts w:ascii="Times New Roman" w:hAnsi="Times New Roman" w:cs="Times New Roman" w:eastAsia="Times New Roman"/>
+          <w:sz w:val="18"/>
+        </w:rPr>
+        <w:t xml:space="preserve">Multiple Brute Force Parse en JFLAP con lab3_extension.jff: resultado de las once cadenas de la tabla anterior.</w:t>
       </w:r>
     </w:p>
     <w:p>

</xml_diff>